<commit_message>
docs: define show-ready scope, budget and acceptance criteria
</commit_message>
<xml_diff>
--- a/docs/management-proposal-th.docx
+++ b/docs/management-proposal-th.docx
@@ -2,7 +2,7 @@
 <file path=word/document.xml><?xml version="1.0" encoding="utf-8"?>
 <w:document xmlns:w="http://schemas.openxmlformats.org/wordprocessingml/2006/main" xmlns:m="http://schemas.openxmlformats.org/officeDocument/2006/math" xmlns:r="http://schemas.openxmlformats.org/officeDocument/2006/relationships" xmlns:o="urn:schemas-microsoft-com:office:office" xmlns:v="urn:schemas-microsoft-com:vml" xmlns:w10="urn:schemas-microsoft-com:office:word" xmlns:a="http://schemas.openxmlformats.org/drawingml/2006/main" xmlns:pic="http://schemas.openxmlformats.org/drawingml/2006/picture" xmlns:wp="http://schemas.openxmlformats.org/drawingml/2006/wordprocessingDrawing">
   <w:body>
-    <w:bookmarkStart w:id="43" w:name="X49861809e5603b12f3141ea263738d784c873f5"/>
+    <w:bookmarkStart w:id="44" w:name="X49861809e5603b12f3141ea263738d784c873f5"/>
     <w:p>
       <w:pPr>
         <w:pStyle w:val="Heading1"/>
@@ -16,16 +16,16 @@
         <w:pStyle w:val="FirstParagraph"/>
       </w:pPr>
       <w:r>
-        <w:t xml:space="preserve">เอกสารประกอบการหารือผู้บริหาร — 20 ตุลาคม 2026 (เวลาไทย)</w:t>
-      </w:r>
-      <w:r>
-        <w:br/>
-      </w:r>
-      <w:r>
-        <w:t xml:space="preserve">เป้าหมายประชุม: 29 ตุลาคม 2026 ตาม PROJECT_CONTEXT.md v1.5</w:t>
-      </w:r>
-      <w:r>
-        <w:br/>
+        <w:t xml:space="preserve">เอกสารประกอบการหารือผู้บริหาร — ปรับปรุง 21 ตุลาคม 2026 (เวลาไทย)</w:t>
+      </w:r>
+      <w:r>
+        <w:t xml:space="preserve"> </w:t>
+      </w:r>
+      <w:r>
+        <w:t xml:space="preserve">เป้าหมายประชุม: 29 ตุลาคม 2026 ตาม PROJECT_CONTEXT.md v1.6</w:t>
+      </w:r>
+      <w:r>
+        <w:t xml:space="preserve"> </w:t>
       </w:r>
       <w:r>
         <w:t xml:space="preserve">สถานะ: ข้อเสนอเพื่ออนุมัติศึกษารายละเอียดและพัฒนาต้นแบบ ไม่ใช่แบบผลิตหรือใบเสนอราคา</w:t>
@@ -45,7 +45,7 @@
         <w:pStyle w:val="FirstParagraph"/>
       </w:pPr>
       <w:r>
-        <w:t xml:space="preserve">พัฒนา Go-kart Simulator แบบ Modular โดยสร้างโครงท่อใหม่ให้มีรูปลักษณ์และท่านั่งใกล้โกคาร์ทจริง ใช้อุปกรณ์พวงมาลัย Force Feedback แป้นเบรก/คันเร่ง เกมสำเร็จรูป และระบบ Motion ที่มีซอฟต์แวร์รองรับ เริ่มจากเครื่องทดลองหนึ่งเครื่อง ก่อนตัดสินใจเครื่องที่สองและการผลิตขาย</w:t>
+        <w:t xml:space="preserve">พัฒนา Go-kart Simulator แบบ Modular โดยสร้างโครงท่อใหม่ให้มีรูปลักษณ์และท่านั่งใกล้โกคาร์ทจริง ใช้อุปกรณ์พวงมาลัย Force Feedback แป้นเบรก/คันเร่ง เกมสำเร็จรูป และระบบ Motion ที่มีซอฟต์แวร์รองรับ ผู้ใช้ยืนยันให้เครื่องแรกพร้อมนำไปโชว์ เสนอเริ่มหนึ่งเครื่องก่อนตัดสินใจเครื่องที่สองและการผลิตขาย โดยจำนวนเครื่องยังรออนุมัติ</w:t>
       </w:r>
     </w:p>
     <w:p>
@@ -109,7 +109,7 @@
         </w:numPr>
       </w:pPr>
       <w:r>
-        <w:t xml:space="preserve">ขอให้ผู้บริหารกำหนดระดับอุปกรณ์ เพดานต้นทุน และขอบเขตว่าเครื่องแรกต้องทดลองได้หรือพร้อมนำไปโชว์</w:t>
+        <w:t xml:space="preserve">ขอให้ผู้บริหารกำหนดระดับอุปกรณ์ เพดานต้นทุน วัน/สถานที่โชว์ และผู้ตรวจรับ; ขอบเขตพร้อมโชว์ผู้ใช้ยืนยันแล้ว</w:t>
       </w:r>
     </w:p>
     <w:p>
@@ -129,7 +129,7 @@
         <w:pStyle w:val="FirstParagraph"/>
       </w:pPr>
       <w:r>
-        <w:t xml:space="preserve">สิ่งที่ได้รับตอนนี้: PROJECT_CONTEXT.md v1.5, prompt ภาพ v02 และคลิป Simufy หนึ่งคลิปประมาณ 24 วินาที ยังไม่ได้รับภาพ v02 หรือแบบติดตั้ง GM5 จริง ข้อมูลที่เอกสารเดิมระบุว่าเคยตรวจเว็บ ยังไม่ได้ตรวจแหล่งต้นทางซ้ำในงานจัดทำข้อเสนอนี้</w:t>
+        <w:t xml:space="preserve">สถานะ ณ 21 ต.ค.: Context v1.6 และภาพ/คลิปอ้างอิงอยู่ใน repository แล้ว ไม่มีแบบติดตั้ง GM5 ที่ตรวจวิศวกรรมหรือผลทดสอบเครื่องจริง ตรวจหน้า Think of sim, GM5 และตัวอย่างจอซ้ำสำหรับแผนงบพร้อมโชว์แล้ว แต่ยังไม่มีใบเสนอราคาไทยครบชุด</w:t>
       </w:r>
     </w:p>
     <w:bookmarkEnd w:id="20"/>
@@ -140,6 +140,14 @@
       </w:pPr>
       <w:r>
         <w:t xml:space="preserve">2. ขอบเขตเครื่องแรก</w:t>
+      </w:r>
+    </w:p>
+    <w:p>
+      <w:pPr>
+        <w:pStyle w:val="FirstParagraph"/>
+      </w:pPr>
+      <w:r>
+        <w:t xml:space="preserve">ผู้ใช้ยืนยัน 21 ต.ค. ให้พร้อมนำไปโชว์ ฐานประเมินเสนอให้ผู้ชมทดลองโดยมีเจ้าหน้าที่ดูแล ไม่ใช่การใช้งานไร้ผู้ดูแล วัน/สถานที่และจำนวน session ยังไม่กำหนด วันที่ 29 ต.ค. เป็นวันเป้าหมายเสนอข้อมูล</w:t>
       </w:r>
     </w:p>
     <w:tbl>
@@ -1166,13 +1174,13 @@
       </w:r>
     </w:p>
     <w:bookmarkEnd w:id="32"/>
-    <w:bookmarkStart w:id="34" w:name="งบประมาณ-กรอบเสนอเพอวางแผน"/>
+    <w:bookmarkStart w:id="35" w:name="งบประมาณเครองพรอมโชว-กรอบเสนอ"/>
     <w:p>
       <w:pPr>
         <w:pStyle w:val="Heading2"/>
       </w:pPr>
       <w:r>
-        <w:t xml:space="preserve">7. งบประมาณ: กรอบเสนอเพื่อวางแผน</w:t>
+        <w:t xml:space="preserve">7. งบประมาณเครื่องพร้อมโชว์: กรอบเสนอ</w:t>
       </w:r>
     </w:p>
     <w:p>
@@ -1180,21 +1188,37 @@
         <w:pStyle w:val="FirstParagraph"/>
       </w:pPr>
       <w:r>
-        <w:t xml:space="preserve">ตัวเลขต่อไปนี้เป็นช่วงงบตั้งขึ้นเพื่อคุยขอบเขต ไม่ใช่ราคาตลาดที่ตรวจแล้วหรือใบเสนอราคา หน่วย: พันบาท/เครื่อง สกุล THB ยังไม่แยก VAT ค่าขนส่ง นำเข้า และส่วนลด ต้องจัดฐานภาษีเดียวกันก่อนอนุมัติยอดจริง</w:t>
+        <w:t xml:space="preserve">ใช้</w:t>
+      </w:r>
+      <w:r>
+        <w:t xml:space="preserve"> </w:t>
+      </w:r>
+      <w:hyperlink r:id="rId33">
+        <w:r>
+          <w:rPr>
+            <w:rStyle w:val="Hyperlink"/>
+          </w:rPr>
+          <w:t xml:space="preserve">แผนงบพร้อมโชว์ 21 ต.ค.</w:t>
+        </w:r>
+      </w:hyperlink>
+      <w:r>
+        <w:t xml:space="preserve"> </w:t>
+      </w:r>
+      <w:r>
+        <w:t xml:space="preserve">แทนช่วงงบเดิมสำหรับขอบเขตนี้ หน่วยพันบาท THB ตัวเลขเป็นประมาณการโครงการ ไม่ใช่ใบเสนอราคาหรือการอนุมัติงบ รุ่นและแบรนด์รอหารือหัวหน้า ตัวเลือกเบรกปกติเป็นเพียงฐานเปรียบเทียบ ไม่ได้ตัดสินใจแทน Active brake</w:t>
       </w:r>
     </w:p>
     <w:tbl>
       <w:tblPr>
         <w:tblStyle w:val="Table"/>
-        <w:tblW w:type="pct" w:w="5000"/>
+        <w:tblW w:type="auto" w:w="0"/>
         <w:jc w:val="left"/>
-        <w:tblLayout w:type="fixed"/>
         <w:tblLook w:firstRow="1" w:lastRow="0" w:firstColumn="0" w:lastColumn="0" w:noHBand="0" w:noVBand="0" w:val="0020"/>
       </w:tblPr>
       <w:tblGrid>
-        <w:gridCol w:w="2376"/>
-        <w:gridCol w:w="3168"/>
-        <w:gridCol w:w="2376"/>
+        <w:gridCol w:w="2640"/>
+        <w:gridCol w:w="2640"/>
+        <w:gridCol w:w="2640"/>
       </w:tblGrid>
       <w:tr>
         <w:trPr>
@@ -1208,7 +1232,7 @@
               <w:jc w:val="left"/>
             </w:pPr>
             <w:r>
-              <w:t xml:space="preserve">หมวดต้นทุนเครื่อง ไม่รวม PC</w:t>
+              <w:t xml:space="preserve">หมวด</w:t>
             </w:r>
           </w:p>
         </w:tc>
@@ -1220,19 +1244,19 @@
               <w:jc w:val="right"/>
             </w:pPr>
             <w:r>
-              <w:t xml:space="preserve">ช่วงตั้งงบ</w:t>
-            </w:r>
-          </w:p>
-        </w:tc>
-        <w:tc>
-          <w:tcPr/>
-          <w:p>
-            <w:pPr>
-              <w:pStyle w:val="Compact"/>
-              <w:jc w:val="left"/>
-            </w:pPr>
-            <w:r>
-              <w:t xml:space="preserve">ขอบเขต</w:t>
+              <w:t xml:space="preserve">เบรกปกติ</w:t>
+            </w:r>
+          </w:p>
+        </w:tc>
+        <w:tc>
+          <w:tcPr/>
+          <w:p>
+            <w:pPr>
+              <w:pStyle w:val="Compact"/>
+              <w:jc w:val="right"/>
+            </w:pPr>
+            <w:r>
+              <w:t xml:space="preserve">Active brake หนึ่งแป้น</w:t>
             </w:r>
           </w:p>
         </w:tc>
@@ -1246,7 +1270,7 @@
               <w:jc w:val="left"/>
             </w:pPr>
             <w:r>
-              <w:t xml:space="preserve">โครงท่อ จุดยึด Motion และงานทำสี</w:t>
+              <w:t xml:space="preserve">เครื่อง รวมงานผิว/ขนย้าย/จัดสาย ไม่รวม Motion และ PC</w:t>
             </w:r>
           </w:p>
         </w:tc>
@@ -1258,19 +1282,19 @@
               <w:jc w:val="right"/>
             </w:pPr>
             <w:r>
-              <w:t xml:space="preserve">25–45</w:t>
-            </w:r>
-          </w:p>
-        </w:tc>
-        <w:tc>
-          <w:tcPr/>
-          <w:p>
-            <w:pPr>
-              <w:pStyle w:val="Compact"/>
-              <w:jc w:val="left"/>
-            </w:pPr>
-            <w:r>
-              <w:t xml:space="preserve">การผลิตโครงหนึ่งชุด ไม่รวมค่าพัฒนาแบบและจิ๊ก</w:t>
+              <w:t xml:space="preserve">162–265</w:t>
+            </w:r>
+          </w:p>
+        </w:tc>
+        <w:tc>
+          <w:tcPr/>
+          <w:p>
+            <w:pPr>
+              <w:pStyle w:val="Compact"/>
+              <w:jc w:val="right"/>
+            </w:pPr>
+            <w:r>
+              <w:t xml:space="preserve">192–300</w:t>
             </w:r>
           </w:p>
         </w:tc>
@@ -1284,7 +1308,7 @@
               <w:jc w:val="left"/>
             </w:pPr>
             <w:r>
-              <w:t xml:space="preserve">พื้น ตัวถัง กันชน ล้อ/ยาง/ดุม</w:t>
+              <w:t xml:space="preserve">พัฒนา/ออกแบบ/ทดสอบ/จิ๊ก (รวมเวลาภายใน)</w:t>
             </w:r>
           </w:p>
         </w:tc>
@@ -1296,19 +1320,19 @@
               <w:jc w:val="right"/>
             </w:pPr>
             <w:r>
-              <w:t xml:space="preserve">12–25</w:t>
-            </w:r>
-          </w:p>
-        </w:tc>
-        <w:tc>
-          <w:tcPr/>
-          <w:p>
-            <w:pPr>
-              <w:pStyle w:val="Compact"/>
-              <w:jc w:val="left"/>
-            </w:pPr>
-            <w:r>
-              <w:t xml:space="preserve">ไม่รวมระบบขับเคลื่อนรถจริง</w:t>
+              <w:t xml:space="preserve">80–150</w:t>
+            </w:r>
+          </w:p>
+        </w:tc>
+        <w:tc>
+          <w:tcPr/>
+          <w:p>
+            <w:pPr>
+              <w:pStyle w:val="Compact"/>
+              <w:jc w:val="right"/>
+            </w:pPr>
+            <w:r>
+              <w:t xml:space="preserve">80–150</w:t>
             </w:r>
           </w:p>
         </w:tc>
@@ -1322,7 +1346,7 @@
               <w:jc w:val="left"/>
             </w:pPr>
             <w:r>
-              <w:t xml:space="preserve">เบาะ ราง และขายึด</w:t>
+              <w:t xml:space="preserve">PC และอุปกรณ์จำเป็น</w:t>
             </w:r>
           </w:p>
         </w:tc>
@@ -1334,19 +1358,19 @@
               <w:jc w:val="right"/>
             </w:pPr>
             <w:r>
-              <w:t xml:space="preserve">8–15</w:t>
-            </w:r>
-          </w:p>
-        </w:tc>
-        <w:tc>
-          <w:tcPr/>
-          <w:p>
-            <w:pPr>
-              <w:pStyle w:val="Compact"/>
-              <w:jc w:val="left"/>
-            </w:pPr>
-            <w:r>
-              <w:t xml:space="preserve">ต้องตรวจเบาะเหมาะกับผู้ใช้และการปรับ</w:t>
+              <w:t xml:space="preserve">50–80</w:t>
+            </w:r>
+          </w:p>
+        </w:tc>
+        <w:tc>
+          <w:tcPr/>
+          <w:p>
+            <w:pPr>
+              <w:pStyle w:val="Compact"/>
+              <w:jc w:val="right"/>
+            </w:pPr>
+            <w:r>
+              <w:t xml:space="preserve">50–80</w:t>
             </w:r>
           </w:p>
         </w:tc>
@@ -1360,7 +1384,7 @@
               <w:jc w:val="left"/>
             </w:pPr>
             <w:r>
-              <w:t xml:space="preserve">ฐาน/วงพวงมาลัย เบรกและคันเร่ง</w:t>
+              <w:t xml:space="preserve">รวมฐาน B</w:t>
             </w:r>
           </w:p>
         </w:tc>
@@ -1372,19 +1396,19 @@
               <w:jc w:val="right"/>
             </w:pPr>
             <w:r>
-              <w:t xml:space="preserve">35–85</w:t>
-            </w:r>
-          </w:p>
-        </w:tc>
-        <w:tc>
-          <w:tcPr/>
-          <w:p>
-            <w:pPr>
-              <w:pStyle w:val="Compact"/>
-              <w:jc w:val="left"/>
-            </w:pPr>
-            <w:r>
-              <w:t xml:space="preserve">กรอบกว้างตามระดับอุปกรณ์; Active brake อาจทำให้เกินช่วง</w:t>
+              <w:t xml:space="preserve">292–495</w:t>
+            </w:r>
+          </w:p>
+        </w:tc>
+        <w:tc>
+          <w:tcPr/>
+          <w:p>
+            <w:pPr>
+              <w:pStyle w:val="Compact"/>
+              <w:jc w:val="right"/>
+            </w:pPr>
+            <w:r>
+              <w:t xml:space="preserve">322–530</w:t>
             </w:r>
           </w:p>
         </w:tc>
@@ -1396,203 +1420,13 @@
             <w:pPr>
               <w:pStyle w:val="Compact"/>
               <w:jc w:val="left"/>
-            </w:pPr>
-            <w:r>
-              <w:t xml:space="preserve">จอ 27 นิ้วสามจอ</w:t>
-            </w:r>
-          </w:p>
-        </w:tc>
-        <w:tc>
-          <w:tcPr/>
-          <w:p>
-            <w:pPr>
-              <w:pStyle w:val="Compact"/>
-              <w:jc w:val="right"/>
-            </w:pPr>
-            <w:r>
-              <w:t xml:space="preserve">18–36</w:t>
-            </w:r>
-          </w:p>
-        </w:tc>
-        <w:tc>
-          <w:tcPr/>
-          <w:p>
-            <w:pPr>
-              <w:pStyle w:val="Compact"/>
-              <w:jc w:val="left"/>
-            </w:pPr>
-            <w:r>
-              <w:t xml:space="preserve">ต้องตัดสินใจ resolution/refresh และตรวจการใช้งานบน Motion</w:t>
-            </w:r>
-          </w:p>
-        </w:tc>
-      </w:tr>
-      <w:tr>
-        <w:tc>
-          <w:tcPr/>
-          <w:p>
-            <w:pPr>
-              <w:pStyle w:val="Compact"/>
-              <w:jc w:val="left"/>
-            </w:pPr>
-            <w:r>
-              <w:t xml:space="preserve">ขาจอและชุดถอดประกอบ</w:t>
-            </w:r>
-          </w:p>
-        </w:tc>
-        <w:tc>
-          <w:tcPr/>
-          <w:p>
-            <w:pPr>
-              <w:pStyle w:val="Compact"/>
-              <w:jc w:val="right"/>
-            </w:pPr>
-            <w:r>
-              <w:t xml:space="preserve">10–20</w:t>
-            </w:r>
-          </w:p>
-        </w:tc>
-        <w:tc>
-          <w:tcPr/>
-          <w:p>
-            <w:pPr>
-              <w:pStyle w:val="Compact"/>
-              <w:jc w:val="left"/>
-            </w:pPr>
-            <w:r>
-              <w:t xml:space="preserve">ไม่รวมพัฒนาแบบ/ทดสอบความสั่น</w:t>
-            </w:r>
-          </w:p>
-        </w:tc>
-      </w:tr>
-      <w:tr>
-        <w:tc>
-          <w:tcPr/>
-          <w:p>
-            <w:pPr>
-              <w:pStyle w:val="Compact"/>
-              <w:jc w:val="left"/>
-            </w:pPr>
-            <w:r>
-              <w:t xml:space="preserve">ไฟฟ้า E-stop สายและอุปกรณ์ย่อย</w:t>
-            </w:r>
-          </w:p>
-        </w:tc>
-        <w:tc>
-          <w:tcPr/>
-          <w:p>
-            <w:pPr>
-              <w:pStyle w:val="Compact"/>
-              <w:jc w:val="right"/>
-            </w:pPr>
-            <w:r>
-              <w:t xml:space="preserve">12–25</w:t>
-            </w:r>
-          </w:p>
-        </w:tc>
-        <w:tc>
-          <w:tcPr/>
-          <w:p>
-            <w:pPr>
-              <w:pStyle w:val="Compact"/>
-              <w:jc w:val="left"/>
-            </w:pPr>
-            <w:r>
-              <w:t xml:space="preserve">ต้องแจกแจงหลังได้ผังไฟ</w:t>
-            </w:r>
-          </w:p>
-        </w:tc>
-      </w:tr>
-      <w:tr>
-        <w:tc>
-          <w:tcPr/>
-          <w:p>
-            <w:pPr>
-              <w:pStyle w:val="Compact"/>
-              <w:jc w:val="left"/>
-            </w:pPr>
-            <w:r>
-              <w:t xml:space="preserve">ประกอบ ตั้งค่า และตรวจเครื่องประจำหน่วย</w:t>
-            </w:r>
-          </w:p>
-        </w:tc>
-        <w:tc>
-          <w:tcPr/>
-          <w:p>
-            <w:pPr>
-              <w:pStyle w:val="Compact"/>
-              <w:jc w:val="right"/>
-            </w:pPr>
-            <w:r>
-              <w:t xml:space="preserve">10–20</w:t>
-            </w:r>
-          </w:p>
-        </w:tc>
-        <w:tc>
-          <w:tcPr/>
-          <w:p>
-            <w:pPr>
-              <w:pStyle w:val="Compact"/>
-              <w:jc w:val="left"/>
-            </w:pPr>
-            <w:r>
-              <w:t xml:space="preserve">ไม่รวมชั่วโมงพัฒนาและทดสอบวิศวกรรม</w:t>
-            </w:r>
-          </w:p>
-        </w:tc>
-      </w:tr>
-      <w:tr>
-        <w:tc>
-          <w:tcPr/>
-          <w:p>
-            <w:pPr>
-              <w:pStyle w:val="Compact"/>
-              <w:jc w:val="left"/>
-            </w:pPr>
-            <w:r>
-              <w:t xml:space="preserve">รวมก่อน Motion</w:t>
-            </w:r>
-          </w:p>
-        </w:tc>
-        <w:tc>
-          <w:tcPr/>
-          <w:p>
-            <w:pPr>
-              <w:pStyle w:val="Compact"/>
-              <w:jc w:val="right"/>
             </w:pPr>
             <w:r>
               <w:rPr>
                 <w:b/>
                 <w:bCs/>
               </w:rPr>
-              <w:t xml:space="preserve">130–271</w:t>
-            </w:r>
-          </w:p>
-        </w:tc>
-        <w:tc>
-          <w:tcPr/>
-          <w:p>
-            <w:pPr>
-              <w:pStyle w:val="Compact"/>
-              <w:jc w:val="left"/>
-            </w:pPr>
-            <w:r>
-              <w:t xml:space="preserve">ยังไม่รวมรายการข้างล่าง</w:t>
-            </w:r>
-          </w:p>
-        </w:tc>
-      </w:tr>
-      <w:tr>
-        <w:tc>
-          <w:tcPr/>
-          <w:p>
-            <w:pPr>
-              <w:pStyle w:val="Compact"/>
-              <w:jc w:val="left"/>
-            </w:pPr>
-            <w:r>
-              <w:t xml:space="preserve">Motion GM5 ครบชุดพร้อมติดตั้ง</w:t>
+              <w:t xml:space="preserve">รวมสำรอง 20% ของ B</w:t>
             </w:r>
           </w:p>
         </w:tc>
@@ -1608,19 +1442,23 @@
                 <w:b/>
                 <w:bCs/>
               </w:rPr>
-              <w:t xml:space="preserve">M: รอราคา</w:t>
-            </w:r>
-          </w:p>
-        </w:tc>
-        <w:tc>
-          <w:tcPr/>
-          <w:p>
-            <w:pPr>
-              <w:pStyle w:val="Compact"/>
-              <w:jc w:val="left"/>
-            </w:pPr>
-            <w:r>
-              <w:t xml:space="preserve">ตรวจ controller, สาย, E-stop, mount และสิทธิ์ซอฟต์แวร์ในชุดเพื่อไม่คิดซ้ำ</w:t>
+              <w:t xml:space="preserve">350.4–594</w:t>
+            </w:r>
+          </w:p>
+        </w:tc>
+        <w:tc>
+          <w:tcPr/>
+          <w:p>
+            <w:pPr>
+              <w:pStyle w:val="Compact"/>
+              <w:jc w:val="right"/>
+            </w:pPr>
+            <w:r>
+              <w:rPr>
+                <w:b/>
+                <w:bCs/>
+              </w:rPr>
+              <w:t xml:space="preserve">386.4–636</w:t>
             </w:r>
           </w:p>
         </w:tc>
@@ -1631,222 +1469,7 @@
         <w:pStyle w:val="BodyText"/>
       </w:pPr>
       <w:r>
-        <w:t xml:space="preserve">ต้นทุนเครื่องอ้างอิง = 130–271 + M พันบาท ก่อนปรับรายการซ้ำและฐานภาษี ไม่ใช่ราคาขาย และยังไม่ใช่เพดานต้นทุนที่ยืนยันว่าทำได้</w:t>
-      </w:r>
-    </w:p>
-    <w:tbl>
-      <w:tblPr>
-        <w:tblStyle w:val="Table"/>
-        <w:tblW w:type="pct" w:w="5000"/>
-        <w:jc w:val="left"/>
-        <w:tblLayout w:type="fixed"/>
-        <w:tblLook w:firstRow="1" w:lastRow="0" w:firstColumn="0" w:lastColumn="0" w:noHBand="0" w:noVBand="0" w:val="0020"/>
-      </w:tblPr>
-      <w:tblGrid>
-        <w:gridCol w:w="2376"/>
-        <w:gridCol w:w="3168"/>
-        <w:gridCol w:w="2376"/>
-      </w:tblGrid>
-      <w:tr>
-        <w:trPr>
-          <w:tblHeader w:val="on"/>
-        </w:trPr>
-        <w:tc>
-          <w:tcPr/>
-          <w:p>
-            <w:pPr>
-              <w:pStyle w:val="Compact"/>
-              <w:jc w:val="left"/>
-            </w:pPr>
-            <w:r>
-              <w:t xml:space="preserve">งบแยกจากเครื่อง</w:t>
-            </w:r>
-          </w:p>
-        </w:tc>
-        <w:tc>
-          <w:tcPr/>
-          <w:p>
-            <w:pPr>
-              <w:pStyle w:val="Compact"/>
-              <w:jc w:val="right"/>
-            </w:pPr>
-            <w:r>
-              <w:t xml:space="preserve">ช่วงตั้งงบ</w:t>
-            </w:r>
-          </w:p>
-        </w:tc>
-        <w:tc>
-          <w:tcPr/>
-          <w:p>
-            <w:pPr>
-              <w:pStyle w:val="Compact"/>
-              <w:jc w:val="left"/>
-            </w:pPr>
-            <w:r>
-              <w:t xml:space="preserve">หมายเหตุ</w:t>
-            </w:r>
-          </w:p>
-        </w:tc>
-      </w:tr>
-      <w:tr>
-        <w:tc>
-          <w:tcPr/>
-          <w:p>
-            <w:pPr>
-              <w:pStyle w:val="Compact"/>
-              <w:jc w:val="left"/>
-            </w:pPr>
-            <w:r>
-              <w:t xml:space="preserve">พัฒนาแบบ mock-up จิ๊ก ชิ้นส่วนทดลอง งานแก้และทดสอบ</w:t>
-            </w:r>
-          </w:p>
-        </w:tc>
-        <w:tc>
-          <w:tcPr/>
-          <w:p>
-            <w:pPr>
-              <w:pStyle w:val="Compact"/>
-              <w:jc w:val="right"/>
-            </w:pPr>
-            <w:r>
-              <w:t xml:space="preserve">60–150</w:t>
-            </w:r>
-          </w:p>
-        </w:tc>
-        <w:tc>
-          <w:tcPr/>
-          <w:p>
-            <w:pPr>
-              <w:pStyle w:val="Compact"/>
-              <w:jc w:val="left"/>
-            </w:pPr>
-            <w:r>
-              <w:t xml:space="preserve">กรอบเบื้องต้น ต้องแตกชั่วโมงและค่าใช้จ่ายจริงก่อนอนุมัติ ไม่ซ้ำงานผลิต/ประกอบในตารางเครื่อง</w:t>
-            </w:r>
-          </w:p>
-        </w:tc>
-      </w:tr>
-      <w:tr>
-        <w:tc>
-          <w:tcPr/>
-          <w:p>
-            <w:pPr>
-              <w:pStyle w:val="Compact"/>
-              <w:jc w:val="left"/>
-            </w:pPr>
-            <w:r>
-              <w:t xml:space="preserve">PC และอุปกรณ์ที่จำเป็น</w:t>
-            </w:r>
-          </w:p>
-        </w:tc>
-        <w:tc>
-          <w:tcPr/>
-          <w:p>
-            <w:pPr>
-              <w:pStyle w:val="Compact"/>
-              <w:jc w:val="right"/>
-            </w:pPr>
-            <w:r>
-              <w:t xml:space="preserve">40–80</w:t>
-            </w:r>
-          </w:p>
-        </w:tc>
-        <w:tc>
-          <w:tcPr/>
-          <w:p>
-            <w:pPr>
-              <w:pStyle w:val="Compact"/>
-              <w:jc w:val="left"/>
-            </w:pPr>
-            <w:r>
-              <w:t xml:space="preserve">ยังไม่ล็อกสเปก ต้องทดสอบเป้าหมายภาพสามจอ</w:t>
-            </w:r>
-          </w:p>
-        </w:tc>
-      </w:tr>
-      <w:tr>
-        <w:tc>
-          <w:tcPr/>
-          <w:p>
-            <w:pPr>
-              <w:pStyle w:val="Compact"/>
-              <w:jc w:val="left"/>
-            </w:pPr>
-            <w:r>
-              <w:t xml:space="preserve">เกม/ไลเซนส์เชิงพาณิชย์และซอฟต์แวร์</w:t>
-            </w:r>
-          </w:p>
-        </w:tc>
-        <w:tc>
-          <w:tcPr/>
-          <w:p>
-            <w:pPr>
-              <w:pStyle w:val="Compact"/>
-              <w:jc w:val="right"/>
-            </w:pPr>
-            <w:r>
-              <w:t xml:space="preserve">L: รอเงื่อนไข/ราคา</w:t>
-            </w:r>
-          </w:p>
-        </w:tc>
-        <w:tc>
-          <w:tcPr/>
-          <w:p>
-            <w:pPr>
-              <w:pStyle w:val="Compact"/>
-              <w:jc w:val="left"/>
-            </w:pPr>
-            <w:r>
-              <w:t xml:space="preserve">อาจเป็นต่อเครื่อง ต่อปี หรือค่าธุรกิจ ห้ามเหมารวมเป็นศูนย์</w:t>
-            </w:r>
-          </w:p>
-        </w:tc>
-      </w:tr>
-      <w:tr>
-        <w:tc>
-          <w:tcPr/>
-          <w:p>
-            <w:pPr>
-              <w:pStyle w:val="Compact"/>
-              <w:jc w:val="left"/>
-            </w:pPr>
-            <w:r>
-              <w:t xml:space="preserve">งบเผื่อ</w:t>
-            </w:r>
-          </w:p>
-        </w:tc>
-        <w:tc>
-          <w:tcPr/>
-          <w:p>
-            <w:pPr>
-              <w:pStyle w:val="Compact"/>
-              <w:jc w:val="right"/>
-            </w:pPr>
-            <w:r>
-              <w:t xml:space="preserve">เสนอ 15–20% ของฐานงบที่กำหนดร่วมกัน</w:t>
-            </w:r>
-          </w:p>
-        </w:tc>
-        <w:tc>
-          <w:tcPr/>
-          <w:p>
-            <w:pPr>
-              <w:pStyle w:val="Compact"/>
-              <w:jc w:val="left"/>
-            </w:pPr>
-            <w:r>
-              <w:t xml:space="preserve">แยกการเปลี่ยนแบบจากภาษี/ขนส่ง ไม่เผื่อซ้ำ</w:t>
-            </w:r>
-          </w:p>
-        </w:tc>
-      </w:tr>
-    </w:tbl>
-    <w:p>
-      <w:pPr>
-        <w:pStyle w:val="BodyText"/>
-      </w:pPr>
-      <w:r>
-        <w:t xml:space="preserve">รวมเครื่องแรก + พัฒนา + PC ก่อนค่าลิขสิทธิ์และรายการที่ยังไม่ทราบ =</w:t>
+        <w:t xml:space="preserve">ข้อเสนอคุยหัวหน้า: ตั้งจุดเริ่มประมาณ</w:t>
       </w:r>
       <w:r>
         <w:t xml:space="preserve"> </w:t>
@@ -1856,13 +1479,13 @@
           <w:b/>
           <w:bCs/>
         </w:rPr>
-        <w:t xml:space="preserve">230–501 + M พันบาท</w:t>
+        <w:t xml:space="preserve">520,000 บาท + รายการรอราคา</w:t>
       </w:r>
       <w:r>
         <w:t xml:space="preserve"> </w:t>
       </w:r>
       <w:r>
-        <w:t xml:space="preserve">แล้วจึงบวก L ภาษี/ขนส่งที่ยังไม่รวม และงบเผื่อตามฐานที่อนุมัติ ช่วงนี้กว้างเพราะยังไม่มีสเปกและใบเสนอราคา จึงเหมาะใช้เลือกขอบเขตมากกว่าใช้ขออนุมัติซื้อทั้งหมด</w:t>
+        <w:t xml:space="preserve">สำหรับกรณี Active brake และใช้ GM5 เดิมได้ ตัวเลขนี้ปัดจากค่ากลาง 511,200 บาท ไม่ใช่เพดานรับประกันหรือยอดรวมครบทุกค่าใช้จ่าย</w:t>
       </w:r>
     </w:p>
     <w:p>
@@ -1870,43 +1493,71 @@
         <w:pStyle w:val="BodyText"/>
       </w:pPr>
       <w:r>
-        <w:t xml:space="preserve">หากยืม GM5 หรือ PC ของบริษัทได้ ให้แยก</w:t>
+        <w:t xml:space="preserve">ต้องเติม</w:t>
       </w:r>
       <w:r>
         <w:t xml:space="preserve"> </w:t>
       </w:r>
       <w:r>
-        <w:t xml:space="preserve">“</w:t>
-      </w:r>
-      <w:r>
-        <w:t xml:space="preserve">เงินสดที่ต้องจ่ายในต้นแบบ</w:t>
-      </w:r>
-      <w:r>
-        <w:t xml:space="preserve">”</w:t>
+        <w:rPr>
+          <w:b/>
+          <w:bCs/>
+        </w:rPr>
+        <w:t xml:space="preserve">M_new</w:t>
       </w:r>
       <w:r>
         <w:t xml:space="preserve"> </w:t>
       </w:r>
       <w:r>
-        <w:t xml:space="preserve">ออกจาก</w:t>
+        <w:t xml:space="preserve">(Motion ที่ต้องซื้อ/ซ่อม/เติมจริง),</w:t>
       </w:r>
       <w:r>
         <w:t xml:space="preserve"> </w:t>
       </w:r>
       <w:r>
-        <w:t xml:space="preserve">“</w:t>
-      </w:r>
-      <w:r>
-        <w:t xml:space="preserve">ต้นทุนทดแทนเพื่อผลิตขาย</w:t>
-      </w:r>
-      <w:r>
-        <w:t xml:space="preserve">”</w:t>
+        <w:rPr>
+          <w:b/>
+          <w:bCs/>
+        </w:rPr>
+        <w:t xml:space="preserve">L</w:t>
       </w:r>
       <w:r>
         <w:t xml:space="preserve"> </w:t>
       </w:r>
       <w:r>
-        <w:t xml:space="preserve">อุปกรณ์ที่ยืมไม่ทำให้ต้นทุนผลิตขายเป็นศูนย์</w:t>
+        <w:t xml:space="preserve">(เกม/สิทธิ์โชว์หรือเชิงพาณิชย์/ซอฟต์แวร์) และ</w:t>
+      </w:r>
+      <w:r>
+        <w:t xml:space="preserve"> </w:t>
+      </w:r>
+      <w:r>
+        <w:rPr>
+          <w:b/>
+          <w:bCs/>
+        </w:rPr>
+        <w:t xml:space="preserve">T</w:t>
+      </w:r>
+      <w:r>
+        <w:t xml:space="preserve"> </w:t>
+      </w:r>
+      <w:r>
+        <w:t xml:space="preserve">(ภาษี/นำเข้า/ส่งที่ยังไม่รวม) ก่อนสรุปยอด สูตรตั้งงบเมื่อเผื่อเท่ากันคือ</w:t>
+      </w:r>
+      <w:r>
+        <w:t xml:space="preserve"> </w:t>
+      </w:r>
+      <w:r>
+        <w:rPr>
+          <w:b/>
+          <w:bCs/>
+        </w:rPr>
+        <w:t xml:space="preserve">1.20 × (B + M_new + L + T)</w:t>
+      </w:r>
+      <w:r>
+        <w:t xml:space="preserve"> </w:t>
+      </w:r>
+      <w:r>
+        <w:t xml:space="preserve">ห้ามบวก VAT กับรายการที่รวมแล้วหรือเผื่อซ้ำ ค่ารถไปงาน บูธ เดินทาง และเจ้าหน้าที่แยกเป็นงบกิจกรรมเมื่อทราบงาน</w:t>
       </w:r>
     </w:p>
     <w:p>
@@ -1914,16 +1565,24 @@
         <w:pStyle w:val="BodyText"/>
       </w:pPr>
       <w:r>
-        <w:t xml:space="preserve">ตัวเลขอ้างอิงจาก Context ซึ่งยังไม่ได้ตรวจเว็บซ้ำ: EVO 12Nm 19,770 บาท, P-Active เดี่ยว 38,050 บาท รวมเฉพาะสองรายการ 57,820 บาท ยังไม่มีวงพวงมาลัย คันเร่ง และอะแดปเตอร์ จึงเห็นได้ว่าแพ็กเกจ Active brake ไม่ควรใช้ค่าต่ำสุด 35,000 บาทเป็นฐาน ราคานี้เป็นราคาขายปลีกในเอกสารเดิม ไม่ใช่ต้นทุน partner หรือยืนยันของพร้อมส่ง</w:t>
-      </w:r>
-    </w:p>
-    <w:bookmarkStart w:id="33" w:name="วธเปลยนชวงงบใหเปน-bom-ทอนมตได"/>
+        <w:t xml:space="preserve">แยกเงินสดต้องจ่ายใหม่จากแรงงานภายในและอุปกรณ์เดิมที่ได้รับจัดสรร; สำหรับต้นทุนผลิตขายต้องใส่ราคาทดแทน GM5 แม้ต้นแบบใช้ของเดิม ไม่คิดเป็นศูนย์ และไม่รวมงบพัฒนาซ้ำกับแรงงานประกอบประจำหน่วย</w:t>
+      </w:r>
+    </w:p>
+    <w:p>
+      <w:pPr>
+        <w:pStyle w:val="BodyText"/>
+      </w:pPr>
+      <w:r>
+        <w:t xml:space="preserve">รายละเอียดทุกหมวด ชั่วโมงพัฒนา สมมติฐาน และแหล่งราคาอยู่ในแผนพร้อมโชว์: ตรวจ Think of sim ซ้ำพบ EVO 12Nm 19,770 และ P-Active เดี่ยว 38,050 บาท รวมเฉพาะสองชิ้น 57,820 บาท ทั้งสองแสดง Sold out; ยังไม่เลือกแบรนด์หรือยืนยันสต็อก ตัวอย่างจอ JIB 6,900 บาทเป็นราคาที่หน้าระบุอัปเดต 21 เม.ย. 2025 และสินค้าหมด จึงไม่ใช่ราคาซื้อปัจจุบัน ราคา GM5 ไทยยังไม่ยืนยัน</w:t>
+      </w:r>
+    </w:p>
+    <w:bookmarkStart w:id="34" w:name="เปลยนชวงงบใหเปน-bom-ทอนมตได"/>
     <w:p>
       <w:pPr>
         <w:pStyle w:val="Heading3"/>
       </w:pPr>
       <w:r>
-        <w:t xml:space="preserve">7.1 วิธีเปลี่ยนช่วงงบให้เป็น BOM ที่อนุมัติได้</w:t>
+        <w:t xml:space="preserve">7.1 เปลี่ยนช่วงงบให้เป็น BOM ที่อนุมัติได้</w:t>
       </w:r>
     </w:p>
     <w:p>
@@ -1931,38 +1590,12 @@
         <w:pStyle w:val="FirstParagraph"/>
       </w:pPr>
       <w:r>
-        <w:t xml:space="preserve">แต่ละรายการต้องมีรหัส ชื่อ จำนวน รุ่น/แบบ ผู้ขาย ราคาต่อหน่วย วันที่/อายุราคา สถานะ VAT/ขนส่ง lead time เงื่อนไขประกัน และรายการรวม/ไม่รวม แยกสถานะ</w:t>
-      </w:r>
-      <w:r>
-        <w:t xml:space="preserve"> </w:t>
-      </w:r>
-      <w:r>
-        <w:t xml:space="preserve">“</w:t>
-      </w:r>
-      <w:r>
-        <w:t xml:space="preserve">มีของ/ยืม/รอราคา/รอเลือก</w:t>
-      </w:r>
-      <w:r>
-        <w:t xml:space="preserve">”</w:t>
-      </w:r>
-      <w:r>
-        <w:t xml:space="preserve"> </w:t>
-      </w:r>
-      <w:r>
-        <w:t xml:space="preserve">ให้ชัด ตรวจรายการใน bundle และ GM5 ก่อนรวมราคา</w:t>
-      </w:r>
-    </w:p>
-    <w:p>
-      <w:pPr>
-        <w:pStyle w:val="BodyText"/>
-      </w:pPr>
-      <w:r>
-        <w:t xml:space="preserve">ต้นทุนขายภายหลังต้องเพิ่มค่าแพ็กกิ้ง ติดตั้งหน้างาน อะไหล่สำรอง ประกันและบริการ ค่าใช้จ่ายองค์กร และค่าธรรมเนียมช่องทางตามธุรกิจจริง จึงค่อยตั้งราคาขาย ไม่เสนอราคาขายจาก BOM อย่างเดียว รอบนี้ยังพักการศึกษาตลาด/คู่แข่งตาม Context</w:t>
-      </w:r>
-    </w:p>
-    <w:bookmarkEnd w:id="33"/>
+        <w:t xml:space="preserve">แต่ละรายการต้องมีรหัส จำนวน รุ่น/แบบ ผู้ขาย ราคา วันที่/อายุราคา VAT/ขนส่ง lead time ประกัน รวม/ไม่รวม และสถานะมีของ/ยืม/รอราคา/รอเลือก ตรวจ bundle และของในชุด GM5 เพื่อไม่คิดซ้ำ ต้นทุนขายภายหลังต้องรวมบริการ อะไหล่ ประกัน ค่าใช้จ่ายองค์กร และต้นทุนธุรกิจเพิ่มเติมก่อนตั้งราคาขาย รอบนี้ยังพักศึกษาตลาด/คู่แข่ง</w:t>
+      </w:r>
+    </w:p>
     <w:bookmarkEnd w:id="34"/>
-    <w:bookmarkStart w:id="36" w:name="แผนดำเนนงานและจดตดสนใจ"/>
+    <w:bookmarkEnd w:id="35"/>
+    <w:bookmarkStart w:id="37" w:name="แผนดำเนนงานและจดตดสนใจ"/>
     <w:p>
       <w:pPr>
         <w:pStyle w:val="Heading2"/>
@@ -1976,7 +1609,7 @@
         <w:pStyle w:val="FirstParagraph"/>
       </w:pPr>
       <w:r>
-        <w:t xml:space="preserve">สมมติฐานเวลา: ทีมเครื่องกลหนึ่งคนและไฟฟ้า/ซอฟต์แวร์หนึ่งคนทำงานได้ใกล้เต็มเวลา ใช้อุปกรณ์สำเร็จรูป ไม่สร้างเกมเอง มีผู้ตรวจงานและผู้ผลิตพร้อม ระยะเสนอ 8–12 สัปดาห์เป็นกรอบวางแผนหลังเริ่มงานและมีอุปกรณ์สำคัญ ต้องประเมินใหม่เมื่อทราบชั่วโมงทีมและ lead time ไม่ใช่กำหนดส่งรับประกัน</w:t>
+        <w:t xml:space="preserve">สมมติฐานเวลา: ทีมเครื่องกลหนึ่งคนและไฟฟ้า/ซอฟต์แวร์หนึ่งคนทำงานได้ใกล้เต็มเวลา ใช้อุปกรณ์สำเร็จรูป ไม่สร้างเกมเอง มีผู้ตรวจงานและผู้ผลิตพร้อม ระยะเสนอเดิม 8–12 สัปดาห์เป็นกรอบตั้งต้นหลังเริ่มงานและมีอุปกรณ์สำคัญ ต้องเพิ่ม/รวมงานผิว ซ้อมโชว์ สถานที่และขนย้ายตามแผนพร้อมโชว์แล้วประเมินเวลาใหม่ ต้องประเมินใหม่เมื่อทราบชั่วโมงทีมและ lead time ไม่ใช่กำหนดส่งรับประกัน</w:t>
       </w:r>
     </w:p>
     <w:tbl>
@@ -2241,7 +1874,7 @@
               <w:jc w:val="left"/>
             </w:pPr>
             <w:r>
-              <w:t xml:space="preserve">ผลตรวจตามรายการครบ ปัญหาร้ายแรงปิดแล้ว</w:t>
+              <w:t xml:space="preserve">ผลตรวจครบ รวม endurance/ซ้อมวันโชว์ ปัญหาความปลอดภัย/เสถียรภาพปิดแล้ว</w:t>
             </w:r>
           </w:p>
         </w:tc>
@@ -2291,7 +1924,7 @@
               <w:jc w:val="left"/>
             </w:pPr>
             <w:r>
-              <w:t xml:space="preserve">ตัดสินใจเครื่องที่สอง/รอบพัฒนาต่อ</w:t>
+              <w:t xml:space="preserve">ปล่อยเครื่องพร้อมโชว์เมื่อผู้ตรวจลงชื่อ แล้วตัดสินใจเครื่องที่สอง/รอบพัฒนาต่อ</w:t>
             </w:r>
           </w:p>
         </w:tc>
@@ -2305,7 +1938,7 @@
         <w:t xml:space="preserve">การอนุมัติต้นแบบไม่ได้แปลว่าพร้อมขายทันที ต้องประเมินความทนทาน การผลิตซ้ำ เอกสารผลิตภัณฑ์ และบริการเพิ่มก่อนเปิดขาย</w:t>
       </w:r>
     </w:p>
-    <w:bookmarkStart w:id="35" w:name="งานทตองมสำหรบประชม-29-ตลาคม"/>
+    <w:bookmarkStart w:id="36" w:name="งานทตองมสำหรบประชม-29-ตลาคม"/>
     <w:p>
       <w:pPr>
         <w:pStyle w:val="Heading3"/>
@@ -2370,15 +2003,15 @@
         <w:t xml:space="preserve">นี่เป็นแผนเสนอ ไม่ได้ยืนยันว่างานหรือการนัดหมายเกิดขึ้นแล้ว การติดต่อผู้ขายต้องมีผู้รับผิดชอบและการมอบหมายจริง</w:t>
       </w:r>
     </w:p>
-    <w:bookmarkEnd w:id="35"/>
     <w:bookmarkEnd w:id="36"/>
-    <w:bookmarkStart w:id="37" w:name="แผนทดสอบและเกณฑตรวจรบตงตน"/>
+    <w:bookmarkEnd w:id="37"/>
+    <w:bookmarkStart w:id="38" w:name="เกณฑตรวจรบเครองพรอมโชว-รางเสนอ-v0.1"/>
     <w:p>
       <w:pPr>
         <w:pStyle w:val="Heading2"/>
       </w:pPr>
       <w:r>
-        <w:t xml:space="preserve">9. แผนทดสอบและเกณฑ์ตรวจรับตั้งต้น</w:t>
+        <w:t xml:space="preserve">9. เกณฑ์ตรวจรับเครื่องพร้อมโชว์ — ร่างเสนอ v0.1</w:t>
       </w:r>
     </w:p>
     <w:p>
@@ -2386,7 +2019,58 @@
         <w:pStyle w:val="FirstParagraph"/>
       </w:pPr>
       <w:r>
-        <w:t xml:space="preserve">ตารางนี้เป็นแผนเสนอ ต้องกำหนดตัวเลข/วิธีวัดและอนุมัติก่อนเริ่มทดสอบ การผ่านไม่ได้เท่ากับการรับรองสินค้าเพื่อจำหน่าย</w:t>
+        <w:t xml:space="preserve">ใช้</w:t>
+      </w:r>
+      <w:r>
+        <w:t xml:space="preserve"> </w:t>
+      </w:r>
+      <w:hyperlink r:id="rId33">
+        <w:r>
+          <w:rPr>
+            <w:rStyle w:val="Hyperlink"/>
+          </w:rPr>
+          <w:t xml:space="preserve">เกณฑ์ A01–A16</w:t>
+        </w:r>
+      </w:hyperlink>
+      <w:r>
+        <w:t xml:space="preserve"> </w:t>
+      </w:r>
+      <w:r>
+        <w:t xml:space="preserve">ครบด้าน: ท่านั่ง/การปรับ โครง/โหลด ระยะเคลื่อน ระบบไฟ การหยุด จอ ภาพ/เสียง Feeling Active brake ความเสถียร งานผิว ขนย้าย เจ้าหน้าที่ สถานที่/สิทธิ์ และเอกสารปล่อยเครื่อง ยังไม่มีผลทดสอบหรือการอนุมัติเกณฑ์ขั้นสุดท้าย</w:t>
+      </w:r>
+    </w:p>
+    <w:p>
+      <w:pPr>
+        <w:pStyle w:val="BodyText"/>
+      </w:pPr>
+      <w:r>
+        <w:t xml:space="preserve">เป้าหมายเสนอที่วัดได้: ทดลองสรีระอย่างน้อย 5 คนและผู้ขับจริงอย่างน้อย 3 คน; Feeling เข้าโค้งและเบรก/เร่งเฉลี่ยแต่ละด้าน ≥3.5/5 ความสบาย ≥4/5; เกมฉากหนัก 30 นาทีเฉลี่ย ≥60 fps และ 1% low ≥45 fps ที่ resolution/settings บันทึก; endurance รวม ≥20 ชม. พร้อมวันจำลองโชว์ 8 ชม. (พักตามคู่มือ); ขนย้าย/ตั้งคืน 2 รอบ เป้าหมาย ≤60 นาที/รอบ; เจ้าหน้าที่อย่างน้อย 2 คนผ่านการฝึก</w:t>
+      </w:r>
+    </w:p>
+    <w:p>
+      <w:pPr>
+        <w:pStyle w:val="BodyText"/>
+      </w:pPr>
+      <w:r>
+        <w:t xml:space="preserve">ต้องกำหนดตัวเลขโหลด/เสียรูป ระยะปลอดภัย แรงขัน เวลา/ระยะหยุด ค่าตรวจไฟและอุณหภูมิจากเครื่องจริงโดยผู้ตรวจที่เหมาะสมก่อนทดสอบ คนไม่เป็นโหลดแรก E-stop ต้องพิจารณา Motion, FFB และ Active brake แยกกัน ไม่ถือว่า GM5 หยุดอุปกรณ์ทั้งหมด</w:t>
+      </w:r>
+    </w:p>
+    <w:p>
+      <w:pPr>
+        <w:pStyle w:val="BodyText"/>
+      </w:pPr>
+      <w:r>
+        <w:t xml:space="preserve">ไม่ปล่อยโชว์หากยังมีปัญหาอันตรายหรือฟังก์ชันหลัก/ความเสถียรไม่ผ่าน ผู้ตรวจแต่ละด้านและผู้อนุมัติปล่อยเครื่องยังต้องแต่งตั้ง ทุก test เก็บรุ่น/firmware โปรไฟล์ โหลด วิธีวัด ผล ภาพ/log และรายการแก้ไข เกณฑ์นี้ไม่ใช่การรับรองผลิตภัณฑ์พร้อมขาย</w:t>
+      </w:r>
+    </w:p>
+    <w:bookmarkEnd w:id="38"/>
+    <w:bookmarkStart w:id="39" w:name="ความเสยงทตองเสนอพรอมแนวทางลด"/>
+    <w:p>
+      <w:pPr>
+        <w:pStyle w:val="Heading2"/>
+      </w:pPr>
+      <w:r>
+        <w:t xml:space="preserve">10. ความเสี่ยงที่ต้องเสนอพร้อมแนวทางลด</w:t>
       </w:r>
     </w:p>
     <w:tbl>
@@ -2414,31 +2098,31 @@
               <w:jc w:val="left"/>
             </w:pPr>
             <w:r>
-              <w:t xml:space="preserve">รายการ</w:t>
-            </w:r>
-          </w:p>
-        </w:tc>
-        <w:tc>
-          <w:tcPr/>
-          <w:p>
-            <w:pPr>
-              <w:pStyle w:val="Compact"/>
-              <w:jc w:val="left"/>
-            </w:pPr>
-            <w:r>
-              <w:t xml:space="preserve">วิธีตรวจ</w:t>
-            </w:r>
-          </w:p>
-        </w:tc>
-        <w:tc>
-          <w:tcPr/>
-          <w:p>
-            <w:pPr>
-              <w:pStyle w:val="Compact"/>
-              <w:jc w:val="left"/>
-            </w:pPr>
-            <w:r>
-              <w:t xml:space="preserve">เงื่อนไขผ่านตั้งต้น</w:t>
+              <w:t xml:space="preserve">ประเด็น</w:t>
+            </w:r>
+          </w:p>
+        </w:tc>
+        <w:tc>
+          <w:tcPr/>
+          <w:p>
+            <w:pPr>
+              <w:pStyle w:val="Compact"/>
+              <w:jc w:val="left"/>
+            </w:pPr>
+            <w:r>
+              <w:t xml:space="preserve">ผลกระทบ</w:t>
+            </w:r>
+          </w:p>
+        </w:tc>
+        <w:tc>
+          <w:tcPr/>
+          <w:p>
+            <w:pPr>
+              <w:pStyle w:val="Compact"/>
+              <w:jc w:val="left"/>
+            </w:pPr>
+            <w:r>
+              <w:t xml:space="preserve">แนวทางก่อนผูกพันงบ</w:t>
             </w:r>
           </w:p>
         </w:tc>
@@ -2452,31 +2136,31 @@
               <w:jc w:val="left"/>
             </w:pPr>
             <w:r>
-              <w:t xml:space="preserve">ท่านั่งและช่วงปรับ</w:t>
-            </w:r>
-          </w:p>
-        </w:tc>
-        <w:tc>
-          <w:tcPr/>
-          <w:p>
-            <w:pPr>
-              <w:pStyle w:val="Compact"/>
-              <w:jc w:val="left"/>
-            </w:pPr>
-            <w:r>
-              <w:t xml:space="preserve">ผู้ทดสอบหลายสรีระรวมใกล้ขอบช่วงเป้าหมาย</w:t>
-            </w:r>
-          </w:p>
-        </w:tc>
-        <w:tc>
-          <w:tcPr/>
-          <w:p>
-            <w:pPr>
-              <w:pStyle w:val="Compact"/>
-              <w:jc w:val="left"/>
-            </w:pPr>
-            <w:r>
-              <w:t xml:space="preserve">เอื้อมแป้น/วงได้ ไม่ติดเข่า ล็อกแน่น ขึ้นลงได้ และบันทึกข้อจำกัด</w:t>
+              <w:t xml:space="preserve">GM5 ติดตั้งชิดโครงตามภาพไม่ได้</w:t>
+            </w:r>
+          </w:p>
+        </w:tc>
+        <w:tc>
+          <w:tcPr/>
+          <w:p>
+            <w:pPr>
+              <w:pStyle w:val="Compact"/>
+              <w:jc w:val="left"/>
+            </w:pPr>
+            <w:r>
+              <w:t xml:space="preserve">อาจต้องปรับ layout หรือศึกษา Motion เพิ่มก่อนตัดสินใจ</w:t>
+            </w:r>
+          </w:p>
+        </w:tc>
+        <w:tc>
+          <w:tcPr/>
+          <w:p>
+            <w:pPr>
+              <w:pStyle w:val="Compact"/>
+              <w:jc w:val="left"/>
+            </w:pPr>
+            <w:r>
+              <w:t xml:space="preserve">ตรวจคู่มือและวิธีติดตั้งที่ผู้ผลิตรองรับก่อนปล่อยแบบ</w:t>
             </w:r>
           </w:p>
         </w:tc>
@@ -2490,31 +2174,31 @@
               <w:jc w:val="left"/>
             </w:pPr>
             <w:r>
-              <w:t xml:space="preserve">โครงและการรับโหลด</w:t>
-            </w:r>
-          </w:p>
-        </w:tc>
-        <w:tc>
-          <w:tcPr/>
-          <w:p>
-            <w:pPr>
-              <w:pStyle w:val="Compact"/>
-              <w:jc w:val="left"/>
-            </w:pPr>
-            <w:r>
-              <w:t xml:space="preserve">ตรวจแบบและทดสอบโหลดตามแผนที่ผู้ตรวจวิศวกรรมกำหนด</w:t>
-            </w:r>
-          </w:p>
-        </w:tc>
-        <w:tc>
-          <w:tcPr/>
-          <w:p>
-            <w:pPr>
-              <w:pStyle w:val="Compact"/>
-              <w:jc w:val="left"/>
-            </w:pPr>
-            <w:r>
-              <w:t xml:space="preserve">ไม่มีเสียรูปถาวร/รอยร้าว/ข้อต่อคลายตามเกณฑ์ที่ตกลง ไม่ใช้คนเป็นโหลดทดสอบแรก</w:t>
+              <w:t xml:space="preserve">น้ำหนัก/CG ไม่เหมาะ</w:t>
+            </w:r>
+          </w:p>
+        </w:tc>
+        <w:tc>
+          <w:tcPr/>
+          <w:p>
+            <w:pPr>
+              <w:pStyle w:val="Compact"/>
+              <w:jc w:val="left"/>
+            </w:pPr>
+            <w:r>
+              <w:t xml:space="preserve">Motion ไม่ได้สมรรถนะและโหลดขาไม่เท่ากัน</w:t>
+            </w:r>
+          </w:p>
+        </w:tc>
+        <w:tc>
+          <w:tcPr/>
+          <w:p>
+            <w:pPr>
+              <w:pStyle w:val="Compact"/>
+              <w:jc w:val="left"/>
+            </w:pPr>
+            <w:r>
+              <w:t xml:space="preserve">ทำ weight budget และตรวจโหลดแบบ dynamic</w:t>
             </w:r>
           </w:p>
         </w:tc>
@@ -2528,31 +2212,31 @@
               <w:jc w:val="left"/>
             </w:pPr>
             <w:r>
-              <w:t xml:space="preserve">ระยะเคลื่อนและสาย</w:t>
-            </w:r>
-          </w:p>
-        </w:tc>
-        <w:tc>
-          <w:tcPr/>
-          <w:p>
-            <w:pPr>
-              <w:pStyle w:val="Compact"/>
-              <w:jc w:val="left"/>
-            </w:pPr>
-            <w:r>
-              <w:t xml:space="preserve">ทดสอบช่วงทำงานที่อนุมัติด้วยโหลดจำลอง</w:t>
-            </w:r>
-          </w:p>
-        </w:tc>
-        <w:tc>
-          <w:tcPr/>
-          <w:p>
-            <w:pPr>
-              <w:pStyle w:val="Compact"/>
-              <w:jc w:val="left"/>
-            </w:pPr>
-            <w:r>
-              <w:t xml:space="preserve">ไม่ชน ไม่หนีบ สายไม่ตึงและไม่มีจุดขัด</w:t>
+              <w:t xml:space="preserve">จอ/ขาจอสั่น</w:t>
+            </w:r>
+          </w:p>
+        </w:tc>
+        <w:tc>
+          <w:tcPr/>
+          <w:p>
+            <w:pPr>
+              <w:pStyle w:val="Compact"/>
+              <w:jc w:val="left"/>
+            </w:pPr>
+            <w:r>
+              <w:t xml:space="preserve">ภาพอ่านยาก ชิ้นส่วนล้า</w:t>
+            </w:r>
+          </w:p>
+        </w:tc>
+        <w:tc>
+          <w:tcPr/>
+          <w:p>
+            <w:pPr>
+              <w:pStyle w:val="Compact"/>
+              <w:jc w:val="left"/>
+            </w:pPr>
+            <w:r>
+              <w:t xml:space="preserve">ใช้น้ำหนักจำลอง ตรวจขาจอและรุ่นจอจริงก่อนตกแต่ง</w:t>
             </w:r>
           </w:p>
         </w:tc>
@@ -2566,31 +2250,31 @@
               <w:jc w:val="left"/>
             </w:pPr>
             <w:r>
-              <w:t xml:space="preserve">E-stop และ restart</w:t>
-            </w:r>
-          </w:p>
-        </w:tc>
-        <w:tc>
-          <w:tcPr/>
-          <w:p>
-            <w:pPr>
-              <w:pStyle w:val="Compact"/>
-              <w:jc w:val="left"/>
-            </w:pPr>
-            <w:r>
-              <w:t xml:space="preserve">ทดสอบขณะเคลื่อนที่ รวมไฟดับ/กลับและ reset</w:t>
-            </w:r>
-          </w:p>
-        </w:tc>
-        <w:tc>
-          <w:tcPr/>
-          <w:p>
-            <w:pPr>
-              <w:pStyle w:val="Compact"/>
-              <w:jc w:val="left"/>
-            </w:pPr>
-            <w:r>
-              <w:t xml:space="preserve">หยุดตามวิธีผู้ผลิตและแผนความปลอดภัย ไม่เคลื่อนเองหลังปลด</w:t>
+              <w:t xml:space="preserve">telemetry ไม่ครบ</w:t>
+            </w:r>
+          </w:p>
+        </w:tc>
+        <w:tc>
+          <w:tcPr/>
+          <w:p>
+            <w:pPr>
+              <w:pStyle w:val="Compact"/>
+              <w:jc w:val="left"/>
+            </w:pPr>
+            <w:r>
+              <w:t xml:space="preserve">Feeling บาง effect ทำไม่ได้</w:t>
+            </w:r>
+          </w:p>
+        </w:tc>
+        <w:tc>
+          <w:tcPr/>
+          <w:p>
+            <w:pPr>
+              <w:pStyle w:val="Compact"/>
+              <w:jc w:val="left"/>
+            </w:pPr>
+            <w:r>
+              <w:t xml:space="preserve">ทดสอบเกมจริงก่อนเลือกเกมและกล่าวอ้างความสามารถ</w:t>
             </w:r>
           </w:p>
         </w:tc>
@@ -2604,31 +2288,31 @@
               <w:jc w:val="left"/>
             </w:pPr>
             <w:r>
-              <w:t xml:space="preserve">สัญญาณขาด</w:t>
-            </w:r>
-          </w:p>
-        </w:tc>
-        <w:tc>
-          <w:tcPr/>
-          <w:p>
-            <w:pPr>
-              <w:pStyle w:val="Compact"/>
-              <w:jc w:val="left"/>
-            </w:pPr>
-            <w:r>
-              <w:t xml:space="preserve">ถอดสัญญาณตามขั้นตอนทดสอบที่ปลอดภัย</w:t>
-            </w:r>
-          </w:p>
-        </w:tc>
-        <w:tc>
-          <w:tcPr/>
-          <w:p>
-            <w:pPr>
-              <w:pStyle w:val="Compact"/>
-              <w:jc w:val="left"/>
-            </w:pPr>
-            <w:r>
-              <w:t xml:space="preserve">เข้าสถานะที่ออกแบบไว้ ไม่มีการกระชากหรือเคลื่อนต่อโดยไม่ควบคุม</w:t>
+              <w:t xml:space="preserve">Active brake ไม่พร้อมหรือแยกติดตั้งไม่ได้</w:t>
+            </w:r>
+          </w:p>
+        </w:tc>
+        <w:tc>
+          <w:tcPr/>
+          <w:p>
+            <w:pPr>
+              <w:pStyle w:val="Compact"/>
+              <w:jc w:val="left"/>
+            </w:pPr>
+            <w:r>
+              <w:t xml:space="preserve">ต้นทุนและกำหนดการเปลี่ยน</w:t>
+            </w:r>
+          </w:p>
+        </w:tc>
+        <w:tc>
+          <w:tcPr/>
+          <w:p>
+            <w:pPr>
+              <w:pStyle w:val="Compact"/>
+              <w:jc w:val="left"/>
+            </w:pPr>
+            <w:r>
+              <w:t xml:space="preserve">ศึกษาเพิ่มและเตรียมผลเปรียบเทียบ passive/Active พร้อมงบและเวลาให้ผู้บริหารเลือก ไม่ลดสเปกเอง</w:t>
             </w:r>
           </w:p>
         </w:tc>
@@ -2642,31 +2326,31 @@
               <w:jc w:val="left"/>
             </w:pPr>
             <w:r>
-              <w:t xml:space="preserve">จอและขาจอ</w:t>
-            </w:r>
-          </w:p>
-        </w:tc>
-        <w:tc>
-          <w:tcPr/>
-          <w:p>
-            <w:pPr>
-              <w:pStyle w:val="Compact"/>
-              <w:jc w:val="left"/>
-            </w:pPr>
-            <w:r>
-              <w:t xml:space="preserve">วิดีโอ/ตรวจข้อต่อที่โหลดและโปรไฟล์สูงสุดที่อนุมัติ</w:t>
-            </w:r>
-          </w:p>
-        </w:tc>
-        <w:tc>
-          <w:tcPr/>
-          <w:p>
-            <w:pPr>
-              <w:pStyle w:val="Compact"/>
-              <w:jc w:val="left"/>
-            </w:pPr>
-            <w:r>
-              <w:t xml:space="preserve">ไม่ชน ไม่หลุด ไม่คลาย ภาพอ่านได้; กำหนดค่าการสั่นที่ยอมรับก่อนตรวจรับ</w:t>
+              <w:t xml:space="preserve">ซอฟต์แวร์ไม่ครอบคลุมเชิงพาณิชย์</w:t>
+            </w:r>
+          </w:p>
+        </w:tc>
+        <w:tc>
+          <w:tcPr/>
+          <w:p>
+            <w:pPr>
+              <w:pStyle w:val="Compact"/>
+              <w:jc w:val="left"/>
+            </w:pPr>
+            <w:r>
+              <w:t xml:space="preserve">ใช้ขาย/ให้บริการตามแผนไม่ได้</w:t>
+            </w:r>
+          </w:p>
+        </w:tc>
+        <w:tc>
+          <w:tcPr/>
+          <w:p>
+            <w:pPr>
+              <w:pStyle w:val="Compact"/>
+              <w:jc w:val="left"/>
+            </w:pPr>
+            <w:r>
+              <w:t xml:space="preserve">ยืนยันเงื่อนไขเป็นลายลักษณ์อักษรก่อนขาย</w:t>
             </w:r>
           </w:p>
         </w:tc>
@@ -2680,31 +2364,31 @@
               <w:jc w:val="left"/>
             </w:pPr>
             <w:r>
-              <w:t xml:space="preserve">Feeling</w:t>
-            </w:r>
-          </w:p>
-        </w:tc>
-        <w:tc>
-          <w:tcPr/>
-          <w:p>
-            <w:pPr>
-              <w:pStyle w:val="Compact"/>
-              <w:jc w:val="left"/>
-            </w:pPr>
-            <w:r>
-              <w:t xml:space="preserve">ผู้ขับจริงอย่างน้อย 3 คนเป็นข้อเสนอ ทดลองเปิด/ปิดและหลายโปรไฟล์</w:t>
-            </w:r>
-          </w:p>
-        </w:tc>
-        <w:tc>
-          <w:tcPr/>
-          <w:p>
-            <w:pPr>
-              <w:pStyle w:val="Compact"/>
-              <w:jc w:val="left"/>
-            </w:pPr>
-            <w:r>
-              <w:t xml:space="preserve">เก็บคะแนน 1–5 ตาม effect ความสบาย และความชอบ กำหนดเป้าหมายก่อนทดสอบ</w:t>
+              <w:t xml:space="preserve">ทีมทำงานไม่เต็มเวลา/อะไหล่รอนาน</w:t>
+            </w:r>
+          </w:p>
+        </w:tc>
+        <w:tc>
+          <w:tcPr/>
+          <w:p>
+            <w:pPr>
+              <w:pStyle w:val="Compact"/>
+              <w:jc w:val="left"/>
+            </w:pPr>
+            <w:r>
+              <w:t xml:space="preserve">ส่งมอบล่าช้า</w:t>
+            </w:r>
+          </w:p>
+        </w:tc>
+        <w:tc>
+          <w:tcPr/>
+          <w:p>
+            <w:pPr>
+              <w:pStyle w:val="Compact"/>
+              <w:jc w:val="left"/>
+            </w:pPr>
+            <w:r>
+              <w:t xml:space="preserve">กำหนดชั่วโมงจริงและ critical path ก่อนตกลงวันส่ง</w:t>
             </w:r>
           </w:p>
         </w:tc>
@@ -2718,128 +2402,52 @@
               <w:jc w:val="left"/>
             </w:pPr>
             <w:r>
-              <w:t xml:space="preserve">ความทนทานเบื้องต้น</w:t>
-            </w:r>
-          </w:p>
-        </w:tc>
-        <w:tc>
-          <w:tcPr/>
-          <w:p>
-            <w:pPr>
-              <w:pStyle w:val="Compact"/>
-              <w:jc w:val="left"/>
-            </w:pPr>
-            <w:r>
-              <w:t xml:space="preserve">เริ่มเสนอ 2 ชม./รอบ รวม 20 ชม. หลังผ่าน safety checks</w:t>
-            </w:r>
-          </w:p>
-        </w:tc>
-        <w:tc>
-          <w:tcPr/>
-          <w:p>
-            <w:pPr>
-              <w:pStyle w:val="Compact"/>
-              <w:jc w:val="left"/>
-            </w:pPr>
-            <w:r>
-              <w:t xml:space="preserve">ไม่มี fault ที่ยังไม่แก้ ตรวจอุณหภูมิ/น็อต/สายตามข้อกำหนดอุปกรณ์; ไม่ใช่ผลทดสอบอายุสินค้า</w:t>
-            </w:r>
-          </w:p>
-        </w:tc>
-      </w:tr>
-      <w:tr>
-        <w:tc>
-          <w:tcPr/>
-          <w:p>
-            <w:pPr>
-              <w:pStyle w:val="Compact"/>
-              <w:jc w:val="left"/>
-            </w:pPr>
-            <w:r>
-              <w:t xml:space="preserve">ประสิทธิภาพภาพ</w:t>
-            </w:r>
-          </w:p>
-        </w:tc>
-        <w:tc>
-          <w:tcPr/>
-          <w:p>
-            <w:pPr>
-              <w:pStyle w:val="Compact"/>
-              <w:jc w:val="left"/>
-            </w:pPr>
-            <w:r>
-              <w:t xml:space="preserve">ฉากหนักบนสามจอ รุ่นเกมและ settings ที่บันทึก</w:t>
-            </w:r>
-          </w:p>
-        </w:tc>
-        <w:tc>
-          <w:tcPr/>
-          <w:p>
-            <w:pPr>
-              <w:pStyle w:val="Compact"/>
-              <w:jc w:val="left"/>
-            </w:pPr>
-            <w:r>
-              <w:t xml:space="preserve">ตัวอย่างเป้าหมาย 60 fps และดู frame time/สะดุดร่วมกัน เป้าจริงให้ผู้บริหารเลือกก่อนซื้อ PC</w:t>
-            </w:r>
-          </w:p>
-        </w:tc>
-      </w:tr>
-      <w:tr>
-        <w:tc>
-          <w:tcPr/>
-          <w:p>
-            <w:pPr>
-              <w:pStyle w:val="Compact"/>
-              <w:jc w:val="left"/>
-            </w:pPr>
-            <w:r>
-              <w:t xml:space="preserve">ขนย้ายและประกอบคืน</w:t>
-            </w:r>
-          </w:p>
-        </w:tc>
-        <w:tc>
-          <w:tcPr/>
-          <w:p>
-            <w:pPr>
-              <w:pStyle w:val="Compact"/>
-              <w:jc w:val="left"/>
-            </w:pPr>
-            <w:r>
-              <w:t xml:space="preserve">ถอดจอ ใช้รถเข็น/อุปกรณ์ยกตามน้ำหนักจริง</w:t>
-            </w:r>
-          </w:p>
-        </w:tc>
-        <w:tc>
-          <w:tcPr/>
-          <w:p>
-            <w:pPr>
-              <w:pStyle w:val="Compact"/>
-              <w:jc w:val="left"/>
-            </w:pPr>
-            <w:r>
-              <w:t xml:space="preserve">ชิ้นส่วนไม่เสียหาย ตั้งค่ากลับได้ ไม่กำหนดว่าสองคนต้องยกทั้งเครื่อง</w:t>
+              <w:t xml:space="preserve">ต้นแบบผ่านแต่ผลิตซ้ำยาก</w:t>
+            </w:r>
+          </w:p>
+        </w:tc>
+        <w:tc>
+          <w:tcPr/>
+          <w:p>
+            <w:pPr>
+              <w:pStyle w:val="Compact"/>
+              <w:jc w:val="left"/>
+            </w:pPr>
+            <w:r>
+              <w:t xml:space="preserve">คุณภาพและกำไรไม่คงที่</w:t>
+            </w:r>
+          </w:p>
+        </w:tc>
+        <w:tc>
+          <w:tcPr/>
+          <w:p>
+            <w:pPr>
+              <w:pStyle w:val="Compact"/>
+              <w:jc w:val="left"/>
+            </w:pPr>
+            <w:r>
+              <w:t xml:space="preserve">ทำจิ๊ก แบบ revision, BOM และวิธีตรวจรับชิ้นส่วน</w:t>
             </w:r>
           </w:p>
         </w:tc>
       </w:tr>
     </w:tbl>
-    <w:p>
-      <w:pPr>
-        <w:pStyle w:val="BodyText"/>
-      </w:pPr>
-      <w:r>
-        <w:t xml:space="preserve">ทุกการทดสอบบันทึกวันที่ ผู้ทดสอบ รุ่นอุปกรณ์ firmware เกม โปรไฟล์ โหลด ระยะเวลา ผล และภาพ/วิดีโอประกอบ แยกผ่าน ไม่ผ่าน ยังไม่ทดสอบ และข้อยกเว้นที่อนุมัติ</w:t>
-      </w:r>
-    </w:p>
-    <w:bookmarkEnd w:id="37"/>
-    <w:bookmarkStart w:id="38" w:name="ความเสยงทตองเสนอพรอมแนวทางลด"/>
+    <w:bookmarkEnd w:id="39"/>
+    <w:bookmarkStart w:id="40" w:name="แบงงานและสงสงมอบ"/>
     <w:p>
       <w:pPr>
         <w:pStyle w:val="Heading2"/>
       </w:pPr>
       <w:r>
-        <w:t xml:space="preserve">10. ความเสี่ยงที่ต้องเสนอพร้อมแนวทางลด</w:t>
+        <w:t xml:space="preserve">11. แบ่งงานและสิ่งส่งมอบ</w:t>
+      </w:r>
+    </w:p>
+    <w:p>
+      <w:pPr>
+        <w:pStyle w:val="FirstParagraph"/>
+      </w:pPr>
+      <w:r>
+        <w:t xml:space="preserve">ผู้ใช้ยืนยัน 21 ต.ค.: Mark ทำโครงสร้าง/Hardware และ Chin ทำวงจรไฟฟ้าและอุปกรณ์ งานซอฟต์แวร์/telemetry ชั่วโมงทีม ผู้ตรวจ และผู้อนุมัติปล่อยเครื่องยังต้องระบุ</w:t>
       </w:r>
     </w:p>
     <w:tbl>
@@ -2867,31 +2475,31 @@
               <w:jc w:val="left"/>
             </w:pPr>
             <w:r>
-              <w:t xml:space="preserve">ประเด็น</w:t>
-            </w:r>
-          </w:p>
-        </w:tc>
-        <w:tc>
-          <w:tcPr/>
-          <w:p>
-            <w:pPr>
-              <w:pStyle w:val="Compact"/>
-              <w:jc w:val="left"/>
-            </w:pPr>
-            <w:r>
-              <w:t xml:space="preserve">ผลกระทบ</w:t>
-            </w:r>
-          </w:p>
-        </w:tc>
-        <w:tc>
-          <w:tcPr/>
-          <w:p>
-            <w:pPr>
-              <w:pStyle w:val="Compact"/>
-              <w:jc w:val="left"/>
-            </w:pPr>
-            <w:r>
-              <w:t xml:space="preserve">แนวทางก่อนผูกพันงบ</w:t>
+              <w:t xml:space="preserve">ผู้รับผิดชอบ</w:t>
+            </w:r>
+          </w:p>
+        </w:tc>
+        <w:tc>
+          <w:tcPr/>
+          <w:p>
+            <w:pPr>
+              <w:pStyle w:val="Compact"/>
+              <w:jc w:val="left"/>
+            </w:pPr>
+            <w:r>
+              <w:t xml:space="preserve">งาน</w:t>
+            </w:r>
+          </w:p>
+        </w:tc>
+        <w:tc>
+          <w:tcPr/>
+          <w:p>
+            <w:pPr>
+              <w:pStyle w:val="Compact"/>
+              <w:jc w:val="left"/>
+            </w:pPr>
+            <w:r>
+              <w:t xml:space="preserve">สิ่งส่งมอบ</w:t>
             </w:r>
           </w:p>
         </w:tc>
@@ -2905,31 +2513,31 @@
               <w:jc w:val="left"/>
             </w:pPr>
             <w:r>
-              <w:t xml:space="preserve">GM5 ติดตั้งชิดโครงตามภาพไม่ได้</w:t>
-            </w:r>
-          </w:p>
-        </w:tc>
-        <w:tc>
-          <w:tcPr/>
-          <w:p>
-            <w:pPr>
-              <w:pStyle w:val="Compact"/>
-              <w:jc w:val="left"/>
-            </w:pPr>
-            <w:r>
-              <w:t xml:space="preserve">ต้องเปลี่ยน layout หรือระบบ Motion</w:t>
-            </w:r>
-          </w:p>
-        </w:tc>
-        <w:tc>
-          <w:tcPr/>
-          <w:p>
-            <w:pPr>
-              <w:pStyle w:val="Compact"/>
-              <w:jc w:val="left"/>
-            </w:pPr>
-            <w:r>
-              <w:t xml:space="preserve">ตรวจคู่มือและวิธีติดตั้งที่ผู้ผลิตรองรับก่อนปล่อยแบบ</w:t>
+              <w:t xml:space="preserve">Mark — โครงสร้าง/Hardware</w:t>
+            </w:r>
+          </w:p>
+        </w:tc>
+        <w:tc>
+          <w:tcPr/>
+          <w:p>
+            <w:pPr>
+              <w:pStyle w:val="Compact"/>
+              <w:jc w:val="left"/>
+            </w:pPr>
+            <w:r>
+              <w:t xml:space="preserve">วัดท่านั่ง layout CAD โหลด ขาจอ และผู้ผลิตโครง</w:t>
+            </w:r>
+          </w:p>
+        </w:tc>
+        <w:tc>
+          <w:tcPr/>
+          <w:p>
+            <w:pPr>
+              <w:pStyle w:val="Compact"/>
+              <w:jc w:val="left"/>
+            </w:pPr>
+            <w:r>
+              <w:t xml:space="preserve">แบบประกอบ/ผลิต BOM กลไก weight budget และผลตรวจ</w:t>
             </w:r>
           </w:p>
         </w:tc>
@@ -2943,31 +2551,31 @@
               <w:jc w:val="left"/>
             </w:pPr>
             <w:r>
-              <w:t xml:space="preserve">น้ำหนัก/CG ไม่เหมาะ</w:t>
-            </w:r>
-          </w:p>
-        </w:tc>
-        <w:tc>
-          <w:tcPr/>
-          <w:p>
-            <w:pPr>
-              <w:pStyle w:val="Compact"/>
-              <w:jc w:val="left"/>
-            </w:pPr>
-            <w:r>
-              <w:t xml:space="preserve">Motion ไม่ได้สมรรถนะและโหลดขาไม่เท่ากัน</w:t>
-            </w:r>
-          </w:p>
-        </w:tc>
-        <w:tc>
-          <w:tcPr/>
-          <w:p>
-            <w:pPr>
-              <w:pStyle w:val="Compact"/>
-              <w:jc w:val="left"/>
-            </w:pPr>
-            <w:r>
-              <w:t xml:space="preserve">ทำ weight budget และตรวจโหลดแบบ dynamic</w:t>
+              <w:t xml:space="preserve">Chin — วงจรไฟฟ้า/อุปกรณ์</w:t>
+            </w:r>
+          </w:p>
+        </w:tc>
+        <w:tc>
+          <w:tcPr/>
+          <w:p>
+            <w:pPr>
+              <w:pStyle w:val="Compact"/>
+              <w:jc w:val="left"/>
+            </w:pPr>
+            <w:r>
+              <w:t xml:space="preserve">ผังไฟ USB, E-stop integration, รายการอุปกรณ์/การเชื่อมต่อ</w:t>
+            </w:r>
+          </w:p>
+        </w:tc>
+        <w:tc>
+          <w:tcPr/>
+          <w:p>
+            <w:pPr>
+              <w:pStyle w:val="Compact"/>
+              <w:jc w:val="left"/>
+            </w:pPr>
+            <w:r>
+              <w:t xml:space="preserve">ผังวงจร ตารางโหลด stop matrix และผลทดสอบ</w:t>
             </w:r>
           </w:p>
         </w:tc>
@@ -2981,31 +2589,31 @@
               <w:jc w:val="left"/>
             </w:pPr>
             <w:r>
-              <w:t xml:space="preserve">จอ/ขาจอสั่น</w:t>
-            </w:r>
-          </w:p>
-        </w:tc>
-        <w:tc>
-          <w:tcPr/>
-          <w:p>
-            <w:pPr>
-              <w:pStyle w:val="Compact"/>
-              <w:jc w:val="left"/>
-            </w:pPr>
-            <w:r>
-              <w:t xml:space="preserve">ภาพอ่านยาก ชิ้นส่วนล้า</w:t>
-            </w:r>
-          </w:p>
-        </w:tc>
-        <w:tc>
-          <w:tcPr/>
-          <w:p>
-            <w:pPr>
-              <w:pStyle w:val="Compact"/>
-              <w:jc w:val="left"/>
-            </w:pPr>
-            <w:r>
-              <w:t xml:space="preserve">ใช้น้ำหนักจำลอง ตรวจขาจอและรุ่นจอจริงก่อนตกแต่ง</w:t>
+              <w:t xml:space="preserve">ซอฟต์แวร์ — ยังต้องระบุ</w:t>
+            </w:r>
+          </w:p>
+        </w:tc>
+        <w:tc>
+          <w:tcPr/>
+          <w:p>
+            <w:pPr>
+              <w:pStyle w:val="Compact"/>
+              <w:jc w:val="left"/>
+            </w:pPr>
+            <w:r>
+              <w:t xml:space="preserve">เกม telemetry, profile, benchmark และ backup</w:t>
+            </w:r>
+          </w:p>
+        </w:tc>
+        <w:tc>
+          <w:tcPr/>
+          <w:p>
+            <w:pPr>
+              <w:pStyle w:val="Compact"/>
+              <w:jc w:val="left"/>
+            </w:pPr>
+            <w:r>
+              <w:t xml:space="preserve">version list, โปรไฟล์ และผลทดสอบ</w:t>
             </w:r>
           </w:p>
         </w:tc>
@@ -3019,31 +2627,31 @@
               <w:jc w:val="left"/>
             </w:pPr>
             <w:r>
-              <w:t xml:space="preserve">telemetry ไม่ครบ</w:t>
-            </w:r>
-          </w:p>
-        </w:tc>
-        <w:tc>
-          <w:tcPr/>
-          <w:p>
-            <w:pPr>
-              <w:pStyle w:val="Compact"/>
-              <w:jc w:val="left"/>
-            </w:pPr>
-            <w:r>
-              <w:t xml:space="preserve">Feeling บาง effect ทำไม่ได้</w:t>
-            </w:r>
-          </w:p>
-        </w:tc>
-        <w:tc>
-          <w:tcPr/>
-          <w:p>
-            <w:pPr>
-              <w:pStyle w:val="Compact"/>
-              <w:jc w:val="left"/>
-            </w:pPr>
-            <w:r>
-              <w:t xml:space="preserve">ทดสอบเกมจริงก่อนเลือกเกมและกล่าวอ้างความสามารถ</w:t>
+              <w:t xml:space="preserve">เจ้าของโครงการ</w:t>
+            </w:r>
+          </w:p>
+        </w:tc>
+        <w:tc>
+          <w:tcPr/>
+          <w:p>
+            <w:pPr>
+              <w:pStyle w:val="Compact"/>
+              <w:jc w:val="left"/>
+            </w:pPr>
+            <w:r>
+              <w:t xml:space="preserve">ขอบเขต งบ การเลือกอุปกรณ์ และประสานผู้ขับ</w:t>
+            </w:r>
+          </w:p>
+        </w:tc>
+        <w:tc>
+          <w:tcPr/>
+          <w:p>
+            <w:pPr>
+              <w:pStyle w:val="Compact"/>
+              <w:jc w:val="left"/>
+            </w:pPr>
+            <w:r>
+              <w:t xml:space="preserve">decision log และรายการอนุมัติ</w:t>
             </w:r>
           </w:p>
         </w:tc>
@@ -3057,158 +2665,148 @@
               <w:jc w:val="left"/>
             </w:pPr>
             <w:r>
-              <w:t xml:space="preserve">Active brake ไม่พร้อมหรือแยกติดตั้งไม่ได้</w:t>
-            </w:r>
-          </w:p>
-        </w:tc>
-        <w:tc>
-          <w:tcPr/>
-          <w:p>
-            <w:pPr>
-              <w:pStyle w:val="Compact"/>
-              <w:jc w:val="left"/>
-            </w:pPr>
-            <w:r>
-              <w:t xml:space="preserve">ต้นทุนและกำหนดการเปลี่ยน</w:t>
-            </w:r>
-          </w:p>
-        </w:tc>
-        <w:tc>
-          <w:tcPr/>
-          <w:p>
-            <w:pPr>
-              <w:pStyle w:val="Compact"/>
-              <w:jc w:val="left"/>
-            </w:pPr>
-            <w:r>
-              <w:t xml:space="preserve">เตรียมทางเลือกแป้น passive และอะแดปเตอร์เปลี่ยนได้ให้ผู้บริหารเลือก</w:t>
-            </w:r>
-          </w:p>
-        </w:tc>
-      </w:tr>
-      <w:tr>
-        <w:tc>
-          <w:tcPr/>
-          <w:p>
-            <w:pPr>
-              <w:pStyle w:val="Compact"/>
-              <w:jc w:val="left"/>
-            </w:pPr>
-            <w:r>
-              <w:t xml:space="preserve">ซอฟต์แวร์ไม่ครอบคลุมเชิงพาณิชย์</w:t>
-            </w:r>
-          </w:p>
-        </w:tc>
-        <w:tc>
-          <w:tcPr/>
-          <w:p>
-            <w:pPr>
-              <w:pStyle w:val="Compact"/>
-              <w:jc w:val="left"/>
-            </w:pPr>
-            <w:r>
-              <w:t xml:space="preserve">ใช้ขาย/ให้บริการตามแผนไม่ได้</w:t>
-            </w:r>
-          </w:p>
-        </w:tc>
-        <w:tc>
-          <w:tcPr/>
-          <w:p>
-            <w:pPr>
-              <w:pStyle w:val="Compact"/>
-              <w:jc w:val="left"/>
-            </w:pPr>
-            <w:r>
-              <w:t xml:space="preserve">ยืนยันเงื่อนไขเป็นลายลักษณ์อักษรก่อนขาย</w:t>
-            </w:r>
-          </w:p>
-        </w:tc>
-      </w:tr>
-      <w:tr>
-        <w:tc>
-          <w:tcPr/>
-          <w:p>
-            <w:pPr>
-              <w:pStyle w:val="Compact"/>
-              <w:jc w:val="left"/>
-            </w:pPr>
-            <w:r>
-              <w:t xml:space="preserve">ทีมทำงานไม่เต็มเวลา/อะไหล่รอนาน</w:t>
-            </w:r>
-          </w:p>
-        </w:tc>
-        <w:tc>
-          <w:tcPr/>
-          <w:p>
-            <w:pPr>
-              <w:pStyle w:val="Compact"/>
-              <w:jc w:val="left"/>
-            </w:pPr>
-            <w:r>
-              <w:t xml:space="preserve">ส่งมอบล่าช้า</w:t>
-            </w:r>
-          </w:p>
-        </w:tc>
-        <w:tc>
-          <w:tcPr/>
-          <w:p>
-            <w:pPr>
-              <w:pStyle w:val="Compact"/>
-              <w:jc w:val="left"/>
-            </w:pPr>
-            <w:r>
-              <w:t xml:space="preserve">กำหนดชั่วโมงจริงและ critical path ก่อนตกลงวันส่ง</w:t>
-            </w:r>
-          </w:p>
-        </w:tc>
-      </w:tr>
-      <w:tr>
-        <w:tc>
-          <w:tcPr/>
-          <w:p>
-            <w:pPr>
-              <w:pStyle w:val="Compact"/>
-              <w:jc w:val="left"/>
-            </w:pPr>
-            <w:r>
-              <w:t xml:space="preserve">ต้นแบบผ่านแต่ผลิตซ้ำยาก</w:t>
-            </w:r>
-          </w:p>
-        </w:tc>
-        <w:tc>
-          <w:tcPr/>
-          <w:p>
-            <w:pPr>
-              <w:pStyle w:val="Compact"/>
-              <w:jc w:val="left"/>
-            </w:pPr>
-            <w:r>
-              <w:t xml:space="preserve">คุณภาพและกำไรไม่คงที่</w:t>
-            </w:r>
-          </w:p>
-        </w:tc>
-        <w:tc>
-          <w:tcPr/>
-          <w:p>
-            <w:pPr>
-              <w:pStyle w:val="Compact"/>
-              <w:jc w:val="left"/>
-            </w:pPr>
-            <w:r>
-              <w:t xml:space="preserve">ทำจิ๊ก แบบ revision, BOM และวิธีตรวจรับชิ้นส่วน</w:t>
+              <w:t xml:space="preserve">ผู้ตรวจงานที่เหมาะสม</w:t>
+            </w:r>
+          </w:p>
+        </w:tc>
+        <w:tc>
+          <w:tcPr/>
+          <w:p>
+            <w:pPr>
+              <w:pStyle w:val="Compact"/>
+              <w:jc w:val="left"/>
+            </w:pPr>
+            <w:r>
+              <w:t xml:space="preserve">ตรวจโครงสร้าง ไฟฟ้า วิธีทดสอบ และข้อกำหนดสินค้า</w:t>
+            </w:r>
+          </w:p>
+        </w:tc>
+        <w:tc>
+          <w:tcPr/>
+          <w:p>
+            <w:pPr>
+              <w:pStyle w:val="Compact"/>
+              <w:jc w:val="left"/>
+            </w:pPr>
+            <w:r>
+              <w:t xml:space="preserve">บันทึกข้อแก้ไข/ผลตรวจตามขอบเขตที่มอบหมาย</w:t>
             </w:r>
           </w:p>
         </w:tc>
       </w:tr>
     </w:tbl>
-    <w:bookmarkEnd w:id="38"/>
-    <w:bookmarkStart w:id="39" w:name="แบงงานและสงสงมอบ"/>
+    <w:p>
+      <w:pPr>
+        <w:pStyle w:val="BodyText"/>
+      </w:pPr>
+      <w:r>
+        <w:t xml:space="preserve">ก่อนส่งต่อเครื่องต้นแบบต้องมีแบบ as-built, BOM พร้อมแหล่งซื้อ, รูปการเดินสาย, serial/version, โปรไฟล์สำรอง, วิธีเปิด–ปิด/หยุดฉุกเฉิน, ข้อจำกัดผู้ใช้, checklist ก่อนใช้, ตารางตรวจบำรุง และประวัติปัญหา</w:t>
+      </w:r>
+    </w:p>
+    <w:bookmarkEnd w:id="40"/>
+    <w:bookmarkStart w:id="41" w:name="คำถามใหผบรหารตดสนใจ"/>
     <w:p>
       <w:pPr>
         <w:pStyle w:val="Heading2"/>
       </w:pPr>
       <w:r>
-        <w:t xml:space="preserve">11. แบ่งงานและสิ่งส่งมอบ</w:t>
+        <w:t xml:space="preserve">12. คำถามให้ผู้บริหารตัดสินใจ</w:t>
+      </w:r>
+    </w:p>
+    <w:p>
+      <w:pPr>
+        <w:pStyle w:val="Compact"/>
+        <w:numPr>
+          <w:ilvl w:val="0"/>
+          <w:numId w:val="1008"/>
+        </w:numPr>
+      </w:pPr>
+      <w:r>
+        <w:t xml:space="preserve">ขอบเขตพร้อมโชว์ยืนยันแล้ว: โชว์วัน/สถานที่ใด จำนวน session ต่อวันเท่าไร และใครตรวจ/อนุมัติปล่อยเครื่อง?</w:t>
+      </w:r>
+    </w:p>
+    <w:p>
+      <w:pPr>
+        <w:pStyle w:val="Compact"/>
+        <w:numPr>
+          <w:ilvl w:val="0"/>
+          <w:numId w:val="1008"/>
+        </w:numPr>
+      </w:pPr>
+      <w:r>
+        <w:t xml:space="preserve">อนุมัติทำหนึ่งเครื่องก่อน แล้วใช้ผลทดลองตัดสินใจเครื่องที่สองหรือไม่?</w:t>
+      </w:r>
+    </w:p>
+    <w:p>
+      <w:pPr>
+        <w:pStyle w:val="Compact"/>
+        <w:numPr>
+          <w:ilvl w:val="0"/>
+          <w:numId w:val="1008"/>
+        </w:numPr>
+      </w:pPr>
+      <w:r>
+        <w:t xml:space="preserve">ระดับอุปกรณ์ขับและแบรนด์ที่ต้องการคืออะไร? Active brake เป็นของหลักหรือออปชัน?</w:t>
+      </w:r>
+    </w:p>
+    <w:p>
+      <w:pPr>
+        <w:pStyle w:val="Compact"/>
+        <w:numPr>
+          <w:ilvl w:val="0"/>
+          <w:numId w:val="1008"/>
+        </w:numPr>
+      </w:pPr>
+      <w:r>
+        <w:t xml:space="preserve">GM5 ที่บริษัทมีพร้อมใช้เมื่อไร และใครยืนยันรุ่น/สภาพ/อุปกรณ์ครบ?</w:t>
+      </w:r>
+    </w:p>
+    <w:p>
+      <w:pPr>
+        <w:pStyle w:val="Compact"/>
+        <w:numPr>
+          <w:ilvl w:val="0"/>
+          <w:numId w:val="1008"/>
+        </w:numPr>
+      </w:pPr>
+      <w:r>
+        <w:t xml:space="preserve">เพดานต้นทุนเครื่องไม่รวม PC และเพดานเงินสดต้นแบบเท่าไร? ใช้ฐานรวม VAT หรือไม่?</w:t>
+      </w:r>
+    </w:p>
+    <w:p>
+      <w:pPr>
+        <w:pStyle w:val="Compact"/>
+        <w:numPr>
+          <w:ilvl w:val="0"/>
+          <w:numId w:val="1008"/>
+        </w:numPr>
+      </w:pPr>
+      <w:r>
+        <w:t xml:space="preserve">Mark/Chin ลงงานได้กี่ชั่วโมงต่อสัปดาห์ ใครรับซอฟต์แวร์ และใครตรวจเครื่องกล/ไฟฟ้า?</w:t>
+      </w:r>
+    </w:p>
+    <w:p>
+      <w:pPr>
+        <w:pStyle w:val="Compact"/>
+        <w:numPr>
+          <w:ilvl w:val="0"/>
+          <w:numId w:val="1008"/>
+        </w:numPr>
+      </w:pPr>
+      <w:r>
+        <w:t xml:space="preserve">อนุมัติระยะ A ก่อน โดยเสนอวงเงินทดลองวัสดุ/ชิ้นส่วนย่อย 10,000–20,000 บาทภายในงบพัฒนา ไม่ใช่เพิ่มจากงบพัฒนา และไม่รวมซื้อ GM5/PC/ชุดขับ ได้หรือไม่?</w:t>
+      </w:r>
+    </w:p>
+    <w:p>
+      <w:pPr>
+        <w:pStyle w:val="Compact"/>
+        <w:numPr>
+          <w:ilvl w:val="0"/>
+          <w:numId w:val="1008"/>
+        </w:numPr>
+      </w:pPr>
+      <w:r>
+        <w:t xml:space="preserve">ผู้ใช้ให้ศึกษาเพิ่มหาก Motion/เกมไม่ผ่าน: ใครรวบรวมผลและนำตัวเลือกพร้อมผลกระทบงบ/เวลาให้ตัดสินใจ?</w:t>
       </w:r>
     </w:p>
     <w:p>
@@ -3216,387 +2814,58 @@
         <w:pStyle w:val="FirstParagraph"/>
       </w:pPr>
       <w:r>
-        <w:t xml:space="preserve">ยังไม่จับคู่ชื่อ Mark/Chin กับบทบาท ให้ผู้บริหารหรือเจ้าของโครงการระบุในประชุม</w:t>
-      </w:r>
-    </w:p>
-    <w:tbl>
-      <w:tblPr>
-        <w:tblStyle w:val="Table"/>
-        <w:tblW w:type="pct" w:w="5000"/>
-        <w:jc w:val="left"/>
-        <w:tblLayout w:type="fixed"/>
-        <w:tblLook w:firstRow="1" w:lastRow="0" w:firstColumn="0" w:lastColumn="0" w:noHBand="0" w:noVBand="0" w:val="0020"/>
-      </w:tblPr>
-      <w:tblGrid>
-        <w:gridCol w:w="2640"/>
-        <w:gridCol w:w="2640"/>
-        <w:gridCol w:w="2640"/>
-      </w:tblGrid>
-      <w:tr>
-        <w:trPr>
-          <w:tblHeader w:val="on"/>
-        </w:trPr>
-        <w:tc>
-          <w:tcPr/>
-          <w:p>
-            <w:pPr>
-              <w:pStyle w:val="Compact"/>
-              <w:jc w:val="left"/>
-            </w:pPr>
-            <w:r>
-              <w:t xml:space="preserve">ผู้รับผิดชอบ</w:t>
-            </w:r>
-          </w:p>
-        </w:tc>
-        <w:tc>
-          <w:tcPr/>
-          <w:p>
-            <w:pPr>
-              <w:pStyle w:val="Compact"/>
-              <w:jc w:val="left"/>
-            </w:pPr>
-            <w:r>
-              <w:t xml:space="preserve">งาน</w:t>
-            </w:r>
-          </w:p>
-        </w:tc>
-        <w:tc>
-          <w:tcPr/>
-          <w:p>
-            <w:pPr>
-              <w:pStyle w:val="Compact"/>
-              <w:jc w:val="left"/>
-            </w:pPr>
-            <w:r>
-              <w:t xml:space="preserve">สิ่งส่งมอบ</w:t>
-            </w:r>
-          </w:p>
-        </w:tc>
-      </w:tr>
-      <w:tr>
-        <w:tc>
-          <w:tcPr/>
-          <w:p>
-            <w:pPr>
-              <w:pStyle w:val="Compact"/>
-              <w:jc w:val="left"/>
-            </w:pPr>
-            <w:r>
-              <w:t xml:space="preserve">เครื่องกล</w:t>
-            </w:r>
-          </w:p>
-        </w:tc>
-        <w:tc>
-          <w:tcPr/>
-          <w:p>
-            <w:pPr>
-              <w:pStyle w:val="Compact"/>
-              <w:jc w:val="left"/>
-            </w:pPr>
-            <w:r>
-              <w:t xml:space="preserve">วัดท่านั่ง layout CAD โหลด ขาจอ และผู้ผลิตโครง</w:t>
-            </w:r>
-          </w:p>
-        </w:tc>
-        <w:tc>
-          <w:tcPr/>
-          <w:p>
-            <w:pPr>
-              <w:pStyle w:val="Compact"/>
-              <w:jc w:val="left"/>
-            </w:pPr>
-            <w:r>
-              <w:t xml:space="preserve">แบบประกอบ/ผลิต BOM กลไก weight budget และผลตรวจ</w:t>
-            </w:r>
-          </w:p>
-        </w:tc>
-      </w:tr>
-      <w:tr>
-        <w:tc>
-          <w:tcPr/>
-          <w:p>
-            <w:pPr>
-              <w:pStyle w:val="Compact"/>
-              <w:jc w:val="left"/>
-            </w:pPr>
-            <w:r>
-              <w:t xml:space="preserve">ไฟฟ้า/ซอฟต์แวร์</w:t>
-            </w:r>
-          </w:p>
-        </w:tc>
-        <w:tc>
-          <w:tcPr/>
-          <w:p>
-            <w:pPr>
-              <w:pStyle w:val="Compact"/>
-              <w:jc w:val="left"/>
-            </w:pPr>
-            <w:r>
-              <w:t xml:space="preserve">ผังไฟ USB, E-stop integration, เกม telemetry และ profile</w:t>
-            </w:r>
-          </w:p>
-        </w:tc>
-        <w:tc>
-          <w:tcPr/>
-          <w:p>
-            <w:pPr>
-              <w:pStyle w:val="Compact"/>
-              <w:jc w:val="left"/>
-            </w:pPr>
-            <w:r>
-              <w:t xml:space="preserve">ผังวงจร ตารางโหลด version list และผลทดสอบ</w:t>
-            </w:r>
-          </w:p>
-        </w:tc>
-      </w:tr>
-      <w:tr>
-        <w:tc>
-          <w:tcPr/>
-          <w:p>
-            <w:pPr>
-              <w:pStyle w:val="Compact"/>
-              <w:jc w:val="left"/>
-            </w:pPr>
-            <w:r>
-              <w:t xml:space="preserve">เจ้าของโครงการ</w:t>
-            </w:r>
-          </w:p>
-        </w:tc>
-        <w:tc>
-          <w:tcPr/>
-          <w:p>
-            <w:pPr>
-              <w:pStyle w:val="Compact"/>
-              <w:jc w:val="left"/>
-            </w:pPr>
-            <w:r>
-              <w:t xml:space="preserve">ขอบเขต งบ การเลือกอุปกรณ์ และประสานผู้ขับ</w:t>
-            </w:r>
-          </w:p>
-        </w:tc>
-        <w:tc>
-          <w:tcPr/>
-          <w:p>
-            <w:pPr>
-              <w:pStyle w:val="Compact"/>
-              <w:jc w:val="left"/>
-            </w:pPr>
-            <w:r>
-              <w:t xml:space="preserve">decision log และรายการอนุมัติ</w:t>
-            </w:r>
-          </w:p>
-        </w:tc>
-      </w:tr>
-      <w:tr>
-        <w:tc>
-          <w:tcPr/>
-          <w:p>
-            <w:pPr>
-              <w:pStyle w:val="Compact"/>
-              <w:jc w:val="left"/>
-            </w:pPr>
-            <w:r>
-              <w:t xml:space="preserve">ผู้ตรวจงานที่เหมาะสม</w:t>
-            </w:r>
-          </w:p>
-        </w:tc>
-        <w:tc>
-          <w:tcPr/>
-          <w:p>
-            <w:pPr>
-              <w:pStyle w:val="Compact"/>
-              <w:jc w:val="left"/>
-            </w:pPr>
-            <w:r>
-              <w:t xml:space="preserve">ตรวจโครงสร้าง ไฟฟ้า วิธีทดสอบ และข้อกำหนดสินค้า</w:t>
-            </w:r>
-          </w:p>
-        </w:tc>
-        <w:tc>
-          <w:tcPr/>
-          <w:p>
-            <w:pPr>
-              <w:pStyle w:val="Compact"/>
-              <w:jc w:val="left"/>
-            </w:pPr>
-            <w:r>
-              <w:t xml:space="preserve">บันทึกข้อแก้ไข/ผลตรวจตามขอบเขตที่มอบหมาย</w:t>
-            </w:r>
-          </w:p>
-        </w:tc>
-      </w:tr>
-    </w:tbl>
+        <w:t xml:space="preserve">ไม่ควรอนุมัติยอดซื้อทั้งหมดจากช่วงงบกว้างนี้ ให้กลับมาดูผลระยะ A, layout, BOM และราคาอีกครั้งที่จุดอนุมัติผลิต</w:t>
+      </w:r>
+    </w:p>
+    <w:bookmarkEnd w:id="41"/>
+    <w:bookmarkStart w:id="42" w:name="โครงพดนำเสนอ-5-นาท"/>
+    <w:p>
+      <w:pPr>
+        <w:pStyle w:val="Heading2"/>
+      </w:pPr>
+      <w:r>
+        <w:t xml:space="preserve">13. โครงพูดนำเสนอ 5 นาที</w:t>
+      </w:r>
+    </w:p>
+    <w:p>
+      <w:pPr>
+        <w:pStyle w:val="FirstParagraph"/>
+      </w:pPr>
+      <w:r>
+        <w:t xml:space="preserve">“เราต้องการพัฒนา Go-kart Simulator แบบ Modular เสนอเริ่มต้นหนึ่งเครื่องพร้อมนำไปโชว์ ใช้โครงที่เราออกแบบเองร่วมกับอุปกรณ์ขับ เกม และ Motion สำเร็จรูป เป้าหมายรอบนี้คือพิสูจน์ว่าท่านั่ง การติดตั้งจอ และ Feeling ทำงานร่วมกันได้ ก่อนลงทุนผลิตซ้ำ</w:t>
+      </w:r>
+    </w:p>
     <w:p>
       <w:pPr>
         <w:pStyle w:val="BodyText"/>
       </w:pPr>
       <w:r>
-        <w:t xml:space="preserve">ก่อนส่งต่อเครื่องต้นแบบต้องมีแบบ as-built, BOM พร้อมแหล่งซื้อ, รูปการเดินสาย, serial/version, โปรไฟล์สำรอง, วิธีเปิด–ปิด/หยุดฉุกเฉิน, ข้อจำกัดผู้ใช้, checklist ก่อนใช้, ตารางตรวจบำรุง และประวัติปัญหา</w:t>
-      </w:r>
-    </w:p>
-    <w:bookmarkEnd w:id="39"/>
-    <w:bookmarkStart w:id="40" w:name="คำถามใหผบรหารตดสนใจ"/>
+        <w:t xml:space="preserve">งานสำคัญแรกคือยืนยัน GM5 กับเกมจริงและโหลดที่ต้องยก จากนั้นทำ mock-up และ layout ก่อนปล่อยแบบโครง เพราะตำแหน่ง Motion และขาจอเป็นจุดเสี่ยงหลัก</w:t>
+      </w:r>
+    </w:p>
+    <w:p>
+      <w:pPr>
+        <w:pStyle w:val="BodyText"/>
+      </w:pPr>
+      <w:r>
+        <w:t xml:space="preserve">งบพร้อมโชว์กรณี Active brake รวมพัฒนา PC และสำรองประมาณ 390,000–640,000 บาท ใช้ค่ากลางปัดประมาณ 520,000 บาทเป็นจุดคุย ยังต้องเติม Motion ที่จ่ายเพิ่ม ไลเซนส์ และภาษี/ขนส่งที่ยังไม่รวม ตัวเลขนี้ไม่ใช่ใบเสนอราคาหรือราคาขาย</w:t>
+      </w:r>
+    </w:p>
+    <w:p>
+      <w:pPr>
+        <w:pStyle w:val="BodyText"/>
+      </w:pPr>
+      <w:r>
+        <w:t xml:space="preserve">ขอบเขตพร้อมโชว์และบทบาท Mark/Chin ยืนยันแล้ว วันนี้ขอให้ตัดสินใจระดับอุปกรณ์ งบทดลอง วันโชว์ เวลาทีม และผู้ตรวจรับ เมื่อผ่านการทดลองจึงกลับมาอนุมัติแบบและงบผลิต พร้อมแผนตรวจรับที่วัดผลได้”</w:t>
+      </w:r>
+    </w:p>
+    <w:bookmarkEnd w:id="42"/>
+    <w:bookmarkStart w:id="43" w:name="ฐานขอมลและขอจำกด"/>
     <w:p>
       <w:pPr>
         <w:pStyle w:val="Heading2"/>
       </w:pPr>
       <w:r>
-        <w:t xml:space="preserve">12. คำถามให้ผู้บริหารตัดสินใจ</w:t>
-      </w:r>
-    </w:p>
-    <w:p>
-      <w:pPr>
-        <w:pStyle w:val="Compact"/>
-        <w:numPr>
-          <w:ilvl w:val="0"/>
-          <w:numId w:val="1008"/>
-        </w:numPr>
-      </w:pPr>
-      <w:r>
-        <w:t xml:space="preserve">เครื่องแรกเป็นชุดทดลองภายใน หรือพร้อมนำไปโชว์? ใครเป็นผู้ตรวจรับ?</w:t>
-      </w:r>
-    </w:p>
-    <w:p>
-      <w:pPr>
-        <w:pStyle w:val="Compact"/>
-        <w:numPr>
-          <w:ilvl w:val="0"/>
-          <w:numId w:val="1008"/>
-        </w:numPr>
-      </w:pPr>
-      <w:r>
-        <w:t xml:space="preserve">อนุมัติทำหนึ่งเครื่องก่อน แล้วใช้ผลทดลองตัดสินใจเครื่องที่สองหรือไม่?</w:t>
-      </w:r>
-    </w:p>
-    <w:p>
-      <w:pPr>
-        <w:pStyle w:val="Compact"/>
-        <w:numPr>
-          <w:ilvl w:val="0"/>
-          <w:numId w:val="1008"/>
-        </w:numPr>
-      </w:pPr>
-      <w:r>
-        <w:t xml:space="preserve">ระดับอุปกรณ์ขับและแบรนด์ที่ต้องการคืออะไร? Active brake เป็นของหลักหรือออปชัน?</w:t>
-      </w:r>
-    </w:p>
-    <w:p>
-      <w:pPr>
-        <w:pStyle w:val="Compact"/>
-        <w:numPr>
-          <w:ilvl w:val="0"/>
-          <w:numId w:val="1008"/>
-        </w:numPr>
-      </w:pPr>
-      <w:r>
-        <w:t xml:space="preserve">GM5 ที่บริษัทมีพร้อมใช้เมื่อไร และใครยืนยันรุ่น/สภาพ/อุปกรณ์ครบ?</w:t>
-      </w:r>
-    </w:p>
-    <w:p>
-      <w:pPr>
-        <w:pStyle w:val="Compact"/>
-        <w:numPr>
-          <w:ilvl w:val="0"/>
-          <w:numId w:val="1008"/>
-        </w:numPr>
-      </w:pPr>
-      <w:r>
-        <w:t xml:space="preserve">เพดานต้นทุนเครื่องไม่รวม PC และเพดานเงินสดต้นแบบเท่าไร? ใช้ฐานรวม VAT หรือไม่?</w:t>
-      </w:r>
-    </w:p>
-    <w:p>
-      <w:pPr>
-        <w:pStyle w:val="Compact"/>
-        <w:numPr>
-          <w:ilvl w:val="0"/>
-          <w:numId w:val="1008"/>
-        </w:numPr>
-      </w:pPr>
-      <w:r>
-        <w:t xml:space="preserve">ให้เวลาแต่ละคนกี่ชั่วโมงต่อสัปดาห์ และใครตรวจเครื่องกล/ไฟฟ้า?</w:t>
-      </w:r>
-    </w:p>
-    <w:p>
-      <w:pPr>
-        <w:pStyle w:val="Compact"/>
-        <w:numPr>
-          <w:ilvl w:val="0"/>
-          <w:numId w:val="1008"/>
-        </w:numPr>
-      </w:pPr>
-      <w:r>
-        <w:t xml:space="preserve">อนุมัติระยะ A ก่อน โดยเสนอวงเงินทดลองวัสดุ/ชิ้นส่วนย่อย 10,000–20,000 บาทภายในงบพัฒนา ไม่ใช่เพิ่มจากงบพัฒนา และไม่รวมซื้อ GM5/PC/ชุดขับ ได้หรือไม่?</w:t>
-      </w:r>
-    </w:p>
-    <w:p>
-      <w:pPr>
-        <w:pStyle w:val="Compact"/>
-        <w:numPr>
-          <w:ilvl w:val="0"/>
-          <w:numId w:val="1008"/>
-        </w:numPr>
-      </w:pPr>
-      <w:r>
-        <w:t xml:space="preserve">หาก Motion/เกมไม่ผ่าน จะอนุมัติเปลี่ยนอุปกรณ์ ปรับขอบเขต หรือหยุดเพื่อศึกษาเพิ่มอย่างไร?</w:t>
-      </w:r>
-    </w:p>
-    <w:p>
-      <w:pPr>
-        <w:pStyle w:val="FirstParagraph"/>
-      </w:pPr>
-      <w:r>
-        <w:t xml:space="preserve">ไม่ควรอนุมัติยอดซื้อทั้งหมดจากช่วงงบกว้างนี้ ให้กลับมาดูผลระยะ A, layout, BOM และราคาอีกครั้งที่จุดอนุมัติผลิต</w:t>
-      </w:r>
-    </w:p>
-    <w:bookmarkEnd w:id="40"/>
-    <w:bookmarkStart w:id="41" w:name="โครงพดนำเสนอ-5-นาท"/>
-    <w:p>
-      <w:pPr>
-        <w:pStyle w:val="Heading2"/>
-      </w:pPr>
-      <w:r>
-        <w:t xml:space="preserve">13. โครงพูดนำเสนอ 5 นาที</w:t>
-      </w:r>
-    </w:p>
-    <w:p>
-      <w:pPr>
-        <w:pStyle w:val="FirstParagraph"/>
-      </w:pPr>
-      <w:r>
-        <w:t xml:space="preserve">“เราต้องการพัฒนา Go-kart Simulator แบบ Modular เริ่มต้นหนึ่งเครื่อง ใช้โครงที่เราออกแบบเองร่วมกับอุปกรณ์ขับ เกม และ Motion สำเร็จรูป เป้าหมายรอบนี้คือพิสูจน์ว่าท่านั่ง การติดตั้งจอ และ Feeling ทำงานร่วมกันได้ ก่อนลงทุนผลิตซ้ำ</w:t>
-      </w:r>
-    </w:p>
-    <w:p>
-      <w:pPr>
-        <w:pStyle w:val="BodyText"/>
-      </w:pPr>
-      <w:r>
-        <w:t xml:space="preserve">งานสำคัญแรกคือยืนยัน GM5 กับเกมจริงและโหลดที่ต้องยก จากนั้นทำ mock-up และ layout ก่อนปล่อยแบบโครง เพราะตำแหน่ง Motion และขาจอเป็นจุดเสี่ยงหลัก</w:t>
-      </w:r>
-    </w:p>
-    <w:p>
-      <w:pPr>
-        <w:pStyle w:val="BodyText"/>
-      </w:pPr>
-      <w:r>
-        <w:t xml:space="preserve">งบยังเป็นกรอบประมาณการ เครื่องก่อน Motion ประมาณ 130,000–271,000 บาท แยกพัฒนาและ PC และยังต้องเติมราคา Motion กับเงื่อนไขซอฟต์แวร์ ตัวเลขนี้ไม่ใช่ใบเสนอราคาหรือราคาขาย</w:t>
-      </w:r>
-    </w:p>
-    <w:p>
-      <w:pPr>
-        <w:pStyle w:val="BodyText"/>
-      </w:pPr>
-      <w:r>
-        <w:t xml:space="preserve">วันนี้ขอให้ตัดสินใจขอบเขตต้นแบบ ระดับอุปกรณ์ งบทดลอง และเวลาทีม เมื่อผ่านการทดลองจึงกลับมาอนุมัติแบบและงบผลิต พร้อมแผนตรวจรับที่วัดผลได้”</w:t>
-      </w:r>
-    </w:p>
-    <w:bookmarkEnd w:id="41"/>
-    <w:bookmarkStart w:id="42" w:name="ฐานขอมลและขอจำกด"/>
-    <w:p>
-      <w:pPr>
-        <w:pStyle w:val="Heading2"/>
-      </w:pPr>
-      <w:r>
         <w:t xml:space="preserve">14. ฐานข้อมูลและข้อจำกัด</w:t>
       </w:r>
     </w:p>
@@ -3609,7 +2878,7 @@
         </w:numPr>
       </w:pPr>
       <w:r>
-        <w:t xml:space="preserve">PROJECT_CONTEXT.md v1.5 ที่ผู้ใช้ส่ง: ใช้เป็นฐานเป้าหมาย ข้อกำหนด ประมาณการน้ำหนัก และข้อมูลอ้างอิงเดิม ไม่ถือว่าอนุมัติการซื้อหรือผลิต</w:t>
+        <w:t xml:space="preserve">PROJECT_CONTEXT.md v1.6 ใน repository และข้อสรุปผู้ใช้ 21 ต.ค.: ใช้เป็นฐานเป้าหมาย ข้อกำหนด ประมาณการน้ำหนัก และข้อมูลอ้างอิงเดิม ไม่ถือว่าอนุมัติการซื้อหรือผลิต</w:t>
       </w:r>
     </w:p>
     <w:p>
@@ -3657,11 +2926,11 @@
         </w:numPr>
       </w:pPr>
       <w:r>
-        <w:t xml:space="preserve">ช่วงงบ ระยะเวลา และเกณฑ์ทดสอบที่เพิ่มในเอกสารนี้เป็นข้อเสนอเพื่อวางแผน ยังไม่มีการขอราคา ตรวจเครื่องจริง ทดสอบโหลด หรือรับรองความปลอดภัย</w:t>
-      </w:r>
-    </w:p>
-    <w:bookmarkEnd w:id="42"/>
+        <w:t xml:space="preserve">งบ/เกณฑ์ล่าสุดอ้างอิง show-ready-plan-th.md วันที่ 21 ต.ค.; ช่วงงบ ระยะเวลา และเกณฑ์ทดสอบเป็นข้อเสนอเพื่อวางแผน ยังไม่มีการขอราคา ตรวจเครื่องจริง ทดสอบโหลด หรือรับรองความปลอดภัย</w:t>
+      </w:r>
+    </w:p>
     <w:bookmarkEnd w:id="43"/>
+    <w:bookmarkEnd w:id="44"/>
     <w:sectPr/>
   </w:body>
 </w:document>
@@ -4567,7 +3836,7 @@
       <w:color w:themeColor="accent1" w:themeShade="BF" w:val="365F91"/>
     </w:rPr>
   </w:style>
-  <w:style w:type="paragraph" w:customStyle="1" w:styleId="SourceCode">
+  <w:style w:customStyle="1" w:styleId="SourceCode" w:type="paragraph">
     <w:name w:val="Source Code"/>
     <w:basedOn w:val="Normal"/>
     <w:link w:val="VerbatimChar"/>
@@ -4575,7 +3844,7 @@
       <w:wordWrap w:val="off"/>
     </w:pPr>
   </w:style>
-  <w:style w:type="character" w:customStyle="1" w:styleId="KeywordTok">
+  <w:style w:customStyle="1" w:styleId="KeywordTok" w:type="character">
     <w:name w:val="KeywordTok"/>
     <w:basedOn w:val="VerbatimChar"/>
     <w:rPr>
@@ -4583,77 +3852,77 @@
       <w:color w:val="007020"/>
     </w:rPr>
   </w:style>
-  <w:style w:type="character" w:customStyle="1" w:styleId="DataTypeTok">
+  <w:style w:customStyle="1" w:styleId="DataTypeTok" w:type="character">
     <w:name w:val="DataTypeTok"/>
     <w:basedOn w:val="VerbatimChar"/>
     <w:rPr>
       <w:color w:val="902000"/>
     </w:rPr>
   </w:style>
-  <w:style w:type="character" w:customStyle="1" w:styleId="DecValTok">
+  <w:style w:customStyle="1" w:styleId="DecValTok" w:type="character">
     <w:name w:val="DecValTok"/>
     <w:basedOn w:val="VerbatimChar"/>
     <w:rPr>
       <w:color w:val="40a070"/>
     </w:rPr>
   </w:style>
-  <w:style w:type="character" w:customStyle="1" w:styleId="BaseNTok">
+  <w:style w:customStyle="1" w:styleId="BaseNTok" w:type="character">
     <w:name w:val="BaseNTok"/>
     <w:basedOn w:val="VerbatimChar"/>
     <w:rPr>
       <w:color w:val="40a070"/>
     </w:rPr>
   </w:style>
-  <w:style w:type="character" w:customStyle="1" w:styleId="FloatTok">
+  <w:style w:customStyle="1" w:styleId="FloatTok" w:type="character">
     <w:name w:val="FloatTok"/>
     <w:basedOn w:val="VerbatimChar"/>
     <w:rPr>
       <w:color w:val="40a070"/>
     </w:rPr>
   </w:style>
-  <w:style w:type="character" w:customStyle="1" w:styleId="ConstantTok">
+  <w:style w:customStyle="1" w:styleId="ConstantTok" w:type="character">
     <w:name w:val="ConstantTok"/>
     <w:basedOn w:val="VerbatimChar"/>
     <w:rPr>
       <w:color w:val="880000"/>
     </w:rPr>
   </w:style>
-  <w:style w:type="character" w:customStyle="1" w:styleId="CharTok">
+  <w:style w:customStyle="1" w:styleId="CharTok" w:type="character">
     <w:name w:val="CharTok"/>
     <w:basedOn w:val="VerbatimChar"/>
     <w:rPr>
       <w:color w:val="4070a0"/>
     </w:rPr>
   </w:style>
-  <w:style w:type="character" w:customStyle="1" w:styleId="SpecialCharTok">
+  <w:style w:customStyle="1" w:styleId="SpecialCharTok" w:type="character">
     <w:name w:val="SpecialCharTok"/>
     <w:basedOn w:val="VerbatimChar"/>
     <w:rPr>
       <w:color w:val="4070a0"/>
     </w:rPr>
   </w:style>
-  <w:style w:type="character" w:customStyle="1" w:styleId="StringTok">
+  <w:style w:customStyle="1" w:styleId="StringTok" w:type="character">
     <w:name w:val="StringTok"/>
     <w:basedOn w:val="VerbatimChar"/>
     <w:rPr>
       <w:color w:val="4070a0"/>
     </w:rPr>
   </w:style>
-  <w:style w:type="character" w:customStyle="1" w:styleId="VerbatimStringTok">
+  <w:style w:customStyle="1" w:styleId="VerbatimStringTok" w:type="character">
     <w:name w:val="VerbatimStringTok"/>
     <w:basedOn w:val="VerbatimChar"/>
     <w:rPr>
       <w:color w:val="4070a0"/>
     </w:rPr>
   </w:style>
-  <w:style w:type="character" w:customStyle="1" w:styleId="SpecialStringTok">
+  <w:style w:customStyle="1" w:styleId="SpecialStringTok" w:type="character">
     <w:name w:val="SpecialStringTok"/>
     <w:basedOn w:val="VerbatimChar"/>
     <w:rPr>
       <w:color w:val="bb6688"/>
     </w:rPr>
   </w:style>
-  <w:style w:type="character" w:customStyle="1" w:styleId="ImportTok">
+  <w:style w:customStyle="1" w:styleId="ImportTok" w:type="character">
     <w:name w:val="ImportTok"/>
     <w:basedOn w:val="VerbatimChar"/>
     <w:rPr>
@@ -4661,7 +3930,7 @@
       <w:color w:val="008000"/>
     </w:rPr>
   </w:style>
-  <w:style w:type="character" w:customStyle="1" w:styleId="CommentTok">
+  <w:style w:customStyle="1" w:styleId="CommentTok" w:type="character">
     <w:name w:val="CommentTok"/>
     <w:basedOn w:val="VerbatimChar"/>
     <w:rPr>
@@ -4669,7 +3938,7 @@
       <w:color w:val="60a0b0"/>
     </w:rPr>
   </w:style>
-  <w:style w:type="character" w:customStyle="1" w:styleId="DocumentationTok">
+  <w:style w:customStyle="1" w:styleId="DocumentationTok" w:type="character">
     <w:name w:val="DocumentationTok"/>
     <w:basedOn w:val="VerbatimChar"/>
     <w:rPr>
@@ -4677,7 +3946,7 @@
       <w:color w:val="ba2121"/>
     </w:rPr>
   </w:style>
-  <w:style w:type="character" w:customStyle="1" w:styleId="AnnotationTok">
+  <w:style w:customStyle="1" w:styleId="AnnotationTok" w:type="character">
     <w:name w:val="AnnotationTok"/>
     <w:basedOn w:val="VerbatimChar"/>
     <w:rPr>
@@ -4686,7 +3955,7 @@
       <w:color w:val="60a0b0"/>
     </w:rPr>
   </w:style>
-  <w:style w:type="character" w:customStyle="1" w:styleId="CommentVarTok">
+  <w:style w:customStyle="1" w:styleId="CommentVarTok" w:type="character">
     <w:name w:val="CommentVarTok"/>
     <w:basedOn w:val="VerbatimChar"/>
     <w:rPr>
@@ -4695,28 +3964,28 @@
       <w:color w:val="60a0b0"/>
     </w:rPr>
   </w:style>
-  <w:style w:type="character" w:customStyle="1" w:styleId="OtherTok">
+  <w:style w:customStyle="1" w:styleId="OtherTok" w:type="character">
     <w:name w:val="OtherTok"/>
     <w:basedOn w:val="VerbatimChar"/>
     <w:rPr>
       <w:color w:val="007020"/>
     </w:rPr>
   </w:style>
-  <w:style w:type="character" w:customStyle="1" w:styleId="FunctionTok">
+  <w:style w:customStyle="1" w:styleId="FunctionTok" w:type="character">
     <w:name w:val="FunctionTok"/>
     <w:basedOn w:val="VerbatimChar"/>
     <w:rPr>
       <w:color w:val="06287e"/>
     </w:rPr>
   </w:style>
-  <w:style w:type="character" w:customStyle="1" w:styleId="VariableTok">
+  <w:style w:customStyle="1" w:styleId="VariableTok" w:type="character">
     <w:name w:val="VariableTok"/>
     <w:basedOn w:val="VerbatimChar"/>
     <w:rPr>
       <w:color w:val="19177c"/>
     </w:rPr>
   </w:style>
-  <w:style w:type="character" w:customStyle="1" w:styleId="ControlFlowTok">
+  <w:style w:customStyle="1" w:styleId="ControlFlowTok" w:type="character">
     <w:name w:val="ControlFlowTok"/>
     <w:basedOn w:val="VerbatimChar"/>
     <w:rPr>
@@ -4724,45 +3993,45 @@
       <w:color w:val="007020"/>
     </w:rPr>
   </w:style>
-  <w:style w:type="character" w:customStyle="1" w:styleId="OperatorTok">
+  <w:style w:customStyle="1" w:styleId="OperatorTok" w:type="character">
     <w:name w:val="OperatorTok"/>
     <w:basedOn w:val="VerbatimChar"/>
     <w:rPr>
       <w:color w:val="666666"/>
     </w:rPr>
   </w:style>
-  <w:style w:type="character" w:customStyle="1" w:styleId="BuiltInTok">
+  <w:style w:customStyle="1" w:styleId="BuiltInTok" w:type="character">
     <w:name w:val="BuiltInTok"/>
     <w:basedOn w:val="VerbatimChar"/>
     <w:rPr>
       <w:color w:val="008000"/>
     </w:rPr>
   </w:style>
-  <w:style w:type="character" w:customStyle="1" w:styleId="ExtensionTok">
+  <w:style w:customStyle="1" w:styleId="ExtensionTok" w:type="character">
     <w:name w:val="ExtensionTok"/>
     <w:basedOn w:val="VerbatimChar"/>
     <w:rPr/>
   </w:style>
-  <w:style w:type="character" w:customStyle="1" w:styleId="PreprocessorTok">
+  <w:style w:customStyle="1" w:styleId="PreprocessorTok" w:type="character">
     <w:name w:val="PreprocessorTok"/>
     <w:basedOn w:val="VerbatimChar"/>
     <w:rPr>
       <w:color w:val="bc7a00"/>
     </w:rPr>
   </w:style>
-  <w:style w:type="character" w:customStyle="1" w:styleId="AttributeTok">
+  <w:style w:customStyle="1" w:styleId="AttributeTok" w:type="character">
     <w:name w:val="AttributeTok"/>
     <w:basedOn w:val="VerbatimChar"/>
     <w:rPr>
       <w:color w:val="7d9029"/>
     </w:rPr>
   </w:style>
-  <w:style w:type="character" w:customStyle="1" w:styleId="RegionMarkerTok">
+  <w:style w:customStyle="1" w:styleId="RegionMarkerTok" w:type="character">
     <w:name w:val="RegionMarkerTok"/>
     <w:basedOn w:val="VerbatimChar"/>
     <w:rPr/>
   </w:style>
-  <w:style w:type="character" w:customStyle="1" w:styleId="InformationTok">
+  <w:style w:customStyle="1" w:styleId="InformationTok" w:type="character">
     <w:name w:val="InformationTok"/>
     <w:basedOn w:val="VerbatimChar"/>
     <w:rPr>
@@ -4771,7 +4040,7 @@
       <w:color w:val="60a0b0"/>
     </w:rPr>
   </w:style>
-  <w:style w:type="character" w:customStyle="1" w:styleId="WarningTok">
+  <w:style w:customStyle="1" w:styleId="WarningTok" w:type="character">
     <w:name w:val="WarningTok"/>
     <w:basedOn w:val="VerbatimChar"/>
     <w:rPr>
@@ -4780,7 +4049,7 @@
       <w:color w:val="60a0b0"/>
     </w:rPr>
   </w:style>
-  <w:style w:type="character" w:customStyle="1" w:styleId="AlertTok">
+  <w:style w:customStyle="1" w:styleId="AlertTok" w:type="character">
     <w:name w:val="AlertTok"/>
     <w:basedOn w:val="VerbatimChar"/>
     <w:rPr>
@@ -4788,7 +4057,7 @@
       <w:color w:val="ff0000"/>
     </w:rPr>
   </w:style>
-  <w:style w:type="character" w:customStyle="1" w:styleId="ErrorTok">
+  <w:style w:customStyle="1" w:styleId="ErrorTok" w:type="character">
     <w:name w:val="ErrorTok"/>
     <w:basedOn w:val="VerbatimChar"/>
     <w:rPr>
@@ -4796,7 +4065,7 @@
       <w:color w:val="ff0000"/>
     </w:rPr>
   </w:style>
-  <w:style w:type="character" w:customStyle="1" w:styleId="NormalTok">
+  <w:style w:customStyle="1" w:styleId="NormalTok" w:type="character">
     <w:name w:val="NormalTok"/>
     <w:basedOn w:val="VerbatimChar"/>
     <w:rPr/>

</xml_diff>

<commit_message>
docs: research kart seating, frame materials and modular assembly
</commit_message>
<xml_diff>
--- a/docs/management-proposal-th.docx
+++ b/docs/management-proposal-th.docx
@@ -2,7 +2,7 @@
 <file path=word/document.xml><?xml version="1.0" encoding="utf-8"?>
 <w:document xmlns:w="http://schemas.openxmlformats.org/wordprocessingml/2006/main" xmlns:m="http://schemas.openxmlformats.org/officeDocument/2006/math" xmlns:r="http://schemas.openxmlformats.org/officeDocument/2006/relationships" xmlns:o="urn:schemas-microsoft-com:office:office" xmlns:v="urn:schemas-microsoft-com:vml" xmlns:w10="urn:schemas-microsoft-com:office:word" xmlns:a="http://schemas.openxmlformats.org/drawingml/2006/main" xmlns:pic="http://schemas.openxmlformats.org/drawingml/2006/picture" xmlns:wp="http://schemas.openxmlformats.org/drawingml/2006/wordprocessingDrawing">
   <w:body>
-    <w:bookmarkStart w:id="44" w:name="X49861809e5603b12f3141ea263738d784c873f5"/>
+    <w:bookmarkStart w:id="45" w:name="X49861809e5603b12f3141ea263738d784c873f5"/>
     <w:p>
       <w:pPr>
         <w:pStyle w:val="Heading1"/>
@@ -22,7 +22,7 @@
         <w:t xml:space="preserve"> </w:t>
       </w:r>
       <w:r>
-        <w:t xml:space="preserve">เป้าหมายประชุม: 29 ตุลาคม 2026 ตาม PROJECT_CONTEXT.md v1.6</w:t>
+        <w:t xml:space="preserve">เป้าหมายประชุม: 29 ตุลาคม 2026 ตาม PROJECT_CONTEXT.md v1.7</w:t>
       </w:r>
       <w:r>
         <w:t xml:space="preserve"> </w:t>
@@ -129,7 +129,7 @@
         <w:pStyle w:val="FirstParagraph"/>
       </w:pPr>
       <w:r>
-        <w:t xml:space="preserve">สถานะ ณ 21 ต.ค.: Context v1.6 และภาพ/คลิปอ้างอิงอยู่ใน repository แล้ว ไม่มีแบบติดตั้ง GM5 ที่ตรวจวิศวกรรมหรือผลทดสอบเครื่องจริง ตรวจหน้า Think of sim, GM5 และตัวอย่างจอซ้ำสำหรับแผนงบพร้อมโชว์แล้ว แต่ยังไม่มีใบเสนอราคาไทยครบชุด</w:t>
+        <w:t xml:space="preserve">สถานะ ณ 21 ต.ค.: Context v1.7 และภาพ/คลิปอ้างอิงอยู่ใน repository แล้ว เปิดและตรวจภาพคู่มือ GM5 ได้แล้ว แต่ไม่มีแบบติดตั้งโครงใหม่ที่ตรวจวิศวกรรมหรือผลทดสอบเครื่องจริง ตรวจหน้า Think of sim, GM5 และตัวอย่างจอซ้ำสำหรับแผนงบพร้อมโชว์แล้ว แต่ยังไม่มีใบเสนอราคาไทยครบชุด</w:t>
       </w:r>
     </w:p>
     <w:bookmarkEnd w:id="20"/>
@@ -692,7 +692,7 @@
     </w:p>
     <w:bookmarkEnd w:id="24"/>
     <w:bookmarkEnd w:id="25"/>
-    <w:bookmarkStart w:id="30" w:name="งานเครองกล-จาก-reference-ไปเปนแบบทผลตได"/>
+    <w:bookmarkStart w:id="31" w:name="งานเครองกล-จาก-reference-ไปเปนแบบทผลตได"/>
     <w:p>
       <w:pPr>
         <w:pStyle w:val="Heading2"/>
@@ -701,7 +701,7 @@
         <w:t xml:space="preserve">4. งานเครื่องกล: จาก reference ไปเป็นแบบที่ผลิตได้</w:t>
       </w:r>
     </w:p>
-    <w:bookmarkStart w:id="26" w:name="วดระยะและทำ-mock-up-กอน-cad-รายละเอยด"/>
+    <w:bookmarkStart w:id="27" w:name="วดระยะและทำ-mock-up-กอน-cad-รายละเอยด"/>
     <w:p>
       <w:pPr>
         <w:pStyle w:val="Heading3"/>
@@ -715,6 +715,28 @@
         <w:pStyle w:val="FirstParagraph"/>
       </w:pPr>
       <w:r>
+        <w:t xml:space="preserve">ผลศึกษาตั้งต้น 21 ต.ค. อยู่ใน</w:t>
+      </w:r>
+      <w:r>
+        <w:t xml:space="preserve"> </w:t>
+      </w:r>
+      <w:hyperlink r:id="rId26">
+        <w:r>
+          <w:rPr>
+            <w:rStyle w:val="Hyperlink"/>
+          </w:rPr>
+          <w:t xml:space="preserve">ท่านั่ง/วัสดุ/วิธีประกอบ</w:t>
+        </w:r>
+      </w:hyperlink>
+      <w:r>
+        <w:t xml:space="preserve">: ใช้ตารางขนาดเบาะผู้ผลิตและช่วงปรับสำหรับทดลอง เสนอท่อกลม STK400 34 × 2.3 ร่วมกล่อง STKR400 40 × 40 × 2.3 มม. พร้อม cradle/adapter ถอดได้ ยังไม่อนุมัติวัสดุหรือขนาดรับโหลด</w:t>
+      </w:r>
+    </w:p>
+    <w:p>
+      <w:pPr>
+        <w:pStyle w:val="BodyText"/>
+      </w:pPr>
+      <w:r>
         <w:t xml:space="preserve">เก็บระยะจากโกคาร์ทจริง: จุดสะโพกและมุมเบาะ ความสูงเบาะจากพื้น ตำแหน่งวงพวงมาลัย ระยะถึงแป้น ความกว้างช่องขา ระยะหัวเข่า และทางขึ้นลง ถ่ายด้านข้าง/บน/หน้าโดยมีสเกล ไม่ใช้สัดส่วนจากคลิปแทนมิติผลิต</w:t>
       </w:r>
     </w:p>
@@ -734,8 +756,8 @@
         <w:t xml:space="preserve">ผลส่งมอบ: ตารางระยะตั้งต้นและช่วงปรับ พร้อมภาพทดลองท่านั่ง และรายการจุดที่ต้องปรับได้</w:t>
       </w:r>
     </w:p>
-    <w:bookmarkEnd w:id="26"/>
-    <w:bookmarkStart w:id="27" w:name="ออกแบบโครงและโมดล"/>
+    <w:bookmarkEnd w:id="27"/>
+    <w:bookmarkStart w:id="28" w:name="ออกแบบโครงและโมดล"/>
     <w:p>
       <w:pPr>
         <w:pStyle w:val="Heading3"/>
@@ -828,8 +850,8 @@
         <w:t xml:space="preserve">ให้ผู้มีความสามารถตรวจโหลด โครงสร้าง รอยเชื่อม และข้อต่อก่อนใช้กับคน การวิเคราะห์ใน CAD เป็นส่วนหนึ่งของหลักฐาน ไม่แทนการตรวจงานจริง</w:t>
       </w:r>
     </w:p>
-    <w:bookmarkEnd w:id="27"/>
-    <w:bookmarkStart w:id="28" w:name="motion-และนำหนก"/>
+    <w:bookmarkEnd w:id="28"/>
+    <w:bookmarkStart w:id="29" w:name="motion-และนำหนก"/>
     <w:p>
       <w:pPr>
         <w:pStyle w:val="Heading3"/>
@@ -922,8 +944,8 @@
         <w:t xml:space="preserve">ขอข้อจำกัดจากผู้ผลิตก่อนเปลี่ยนตำแหน่ง actuator หรือขายึดจากรูปแบบที่ผู้ผลิตรองรับ</w:t>
       </w:r>
     </w:p>
-    <w:bookmarkEnd w:id="28"/>
-    <w:bookmarkStart w:id="29" w:name="ขาจอสามจอ"/>
+    <w:bookmarkEnd w:id="29"/>
+    <w:bookmarkStart w:id="30" w:name="ขาจอสามจอ"/>
     <w:p>
       <w:pPr>
         <w:pStyle w:val="Heading3"/>
@@ -948,9 +970,9 @@
         <w:t xml:space="preserve">เริ่มทดสอบด้วยน้ำหนักจำลองที่ยึดอย่างเหมาะสมก่อนติดจอจริง ไม่สรุปว่าจอทั่วไปทน Motion ได้โดยไม่มีข้อมูลหรือทดสอบ</w:t>
       </w:r>
     </w:p>
-    <w:bookmarkEnd w:id="29"/>
     <w:bookmarkEnd w:id="30"/>
-    <w:bookmarkStart w:id="31" w:name="ระบบไฟฟาและการหยดฉกเฉน"/>
+    <w:bookmarkEnd w:id="31"/>
+    <w:bookmarkStart w:id="32" w:name="ระบบไฟฟาและการหยดฉกเฉน"/>
     <w:p>
       <w:pPr>
         <w:pStyle w:val="Heading2"/>
@@ -1059,8 +1081,8 @@
         <w:t xml:space="preserve">การเลือกมาตรฐานและการประเมินข้อกำหนดผลิตภัณฑ์ในไทยต้องอิงการจัดประเภทสินค้าจริง ให้ผู้เชี่ยวชาญตรวจด้านเครื่องจักร ไฟฟ้า EMC และเอกสารที่ต้องมี ก่อนวางขาย ไม่ถือว่าการใช้อุปกรณ์สำเร็จรูปทำให้ทั้งเครื่องได้รับการรับรองแล้ว</w:t>
       </w:r>
     </w:p>
-    <w:bookmarkEnd w:id="31"/>
-    <w:bookmarkStart w:id="32" w:name="ซอฟตแวร-เกม-และการสราง-feeling"/>
+    <w:bookmarkEnd w:id="32"/>
+    <w:bookmarkStart w:id="33" w:name="ซอฟตแวร-เกม-และการสราง-feeling"/>
     <w:p>
       <w:pPr>
         <w:pStyle w:val="Heading2"/>
@@ -1173,8 +1195,8 @@
         <w:t xml:space="preserve">ประเด็นสิทธิ์ใช้งาน: ตรวจแยกสิทธิ์เกม SimHub Motion และซอฟต์แวร์อุปกรณ์ สำหรับขายเครื่องพร้อมซอฟต์แวร์ ให้บริการเล่น จัดงาน และหลายเครื่อง ขอหลักฐานเงื่อนไขที่ใช้กับรูปแบบธุรกิจ ไม่ถือว่าไลเซนส์ส่วนบุคคลใช้เชิงพาณิชย์ได้อัตโนมัติ</w:t>
       </w:r>
     </w:p>
-    <w:bookmarkEnd w:id="32"/>
-    <w:bookmarkStart w:id="35" w:name="งบประมาณเครองพรอมโชว-กรอบเสนอ"/>
+    <w:bookmarkEnd w:id="33"/>
+    <w:bookmarkStart w:id="36" w:name="งบประมาณเครองพรอมโชว-กรอบเสนอ"/>
     <w:p>
       <w:pPr>
         <w:pStyle w:val="Heading2"/>
@@ -1193,7 +1215,7 @@
       <w:r>
         <w:t xml:space="preserve"> </w:t>
       </w:r>
-      <w:hyperlink r:id="rId33">
+      <w:hyperlink r:id="rId34">
         <w:r>
           <w:rPr>
             <w:rStyle w:val="Hyperlink"/>
@@ -1576,7 +1598,7 @@
         <w:t xml:space="preserve">รายละเอียดทุกหมวด ชั่วโมงพัฒนา สมมติฐาน และแหล่งราคาอยู่ในแผนพร้อมโชว์: ตรวจ Think of sim ซ้ำพบ EVO 12Nm 19,770 และ P-Active เดี่ยว 38,050 บาท รวมเฉพาะสองชิ้น 57,820 บาท ทั้งสองแสดง Sold out; ยังไม่เลือกแบรนด์หรือยืนยันสต็อก ตัวอย่างจอ JIB 6,900 บาทเป็นราคาที่หน้าระบุอัปเดต 21 เม.ย. 2025 และสินค้าหมด จึงไม่ใช่ราคาซื้อปัจจุบัน ราคา GM5 ไทยยังไม่ยืนยัน</w:t>
       </w:r>
     </w:p>
-    <w:bookmarkStart w:id="34" w:name="เปลยนชวงงบใหเปน-bom-ทอนมตได"/>
+    <w:bookmarkStart w:id="35" w:name="เปลยนชวงงบใหเปน-bom-ทอนมตได"/>
     <w:p>
       <w:pPr>
         <w:pStyle w:val="Heading3"/>
@@ -1593,9 +1615,9 @@
         <w:t xml:space="preserve">แต่ละรายการต้องมีรหัส จำนวน รุ่น/แบบ ผู้ขาย ราคา วันที่/อายุราคา VAT/ขนส่ง lead time ประกัน รวม/ไม่รวม และสถานะมีของ/ยืม/รอราคา/รอเลือก ตรวจ bundle และของในชุด GM5 เพื่อไม่คิดซ้ำ ต้นทุนขายภายหลังต้องรวมบริการ อะไหล่ ประกัน ค่าใช้จ่ายองค์กร และต้นทุนธุรกิจเพิ่มเติมก่อนตั้งราคาขาย รอบนี้ยังพักศึกษาตลาด/คู่แข่ง</w:t>
       </w:r>
     </w:p>
-    <w:bookmarkEnd w:id="34"/>
     <w:bookmarkEnd w:id="35"/>
-    <w:bookmarkStart w:id="37" w:name="แผนดำเนนงานและจดตดสนใจ"/>
+    <w:bookmarkEnd w:id="36"/>
+    <w:bookmarkStart w:id="38" w:name="แผนดำเนนงานและจดตดสนใจ"/>
     <w:p>
       <w:pPr>
         <w:pStyle w:val="Heading2"/>
@@ -1938,7 +1960,7 @@
         <w:t xml:space="preserve">การอนุมัติต้นแบบไม่ได้แปลว่าพร้อมขายทันที ต้องประเมินความทนทาน การผลิตซ้ำ เอกสารผลิตภัณฑ์ และบริการเพิ่มก่อนเปิดขาย</w:t>
       </w:r>
     </w:p>
-    <w:bookmarkStart w:id="36" w:name="งานทตองมสำหรบประชม-29-ตลาคม"/>
+    <w:bookmarkStart w:id="37" w:name="งานทตองมสำหรบประชม-29-ตลาคม"/>
     <w:p>
       <w:pPr>
         <w:pStyle w:val="Heading3"/>
@@ -2003,9 +2025,9 @@
         <w:t xml:space="preserve">นี่เป็นแผนเสนอ ไม่ได้ยืนยันว่างานหรือการนัดหมายเกิดขึ้นแล้ว การติดต่อผู้ขายต้องมีผู้รับผิดชอบและการมอบหมายจริง</w:t>
       </w:r>
     </w:p>
-    <w:bookmarkEnd w:id="36"/>
     <w:bookmarkEnd w:id="37"/>
-    <w:bookmarkStart w:id="38" w:name="เกณฑตรวจรบเครองพรอมโชว-รางเสนอ-v0.1"/>
+    <w:bookmarkEnd w:id="38"/>
+    <w:bookmarkStart w:id="39" w:name="เกณฑตรวจรบเครองพรอมโชว-รางเสนอ-v0.1"/>
     <w:p>
       <w:pPr>
         <w:pStyle w:val="Heading2"/>
@@ -2024,7 +2046,7 @@
       <w:r>
         <w:t xml:space="preserve"> </w:t>
       </w:r>
-      <w:hyperlink r:id="rId33">
+      <w:hyperlink r:id="rId34">
         <w:r>
           <w:rPr>
             <w:rStyle w:val="Hyperlink"/>
@@ -2052,6 +2074,14 @@
         <w:pStyle w:val="BodyText"/>
       </w:pPr>
       <w:r>
+        <w:t xml:space="preserve">ตรวจคู่มือ GM5 ได้แล้ว: เมื่อโหลดรวมเกิน 200 กก. จำกัดเล่นต่อเนื่องไม่เกิน 4 ชม. ต้องยืนยันช่วงพัก/duty cycle ก่อนซ้อมวันโชว์ 8 ชม.; รายงานใหม่อธิบายผลต่อกรอบน้ำหนักและการติดตั้ง</w:t>
+      </w:r>
+    </w:p>
+    <w:p>
+      <w:pPr>
+        <w:pStyle w:val="BodyText"/>
+      </w:pPr>
+      <w:r>
         <w:t xml:space="preserve">ต้องกำหนดตัวเลขโหลด/เสียรูป ระยะปลอดภัย แรงขัน เวลา/ระยะหยุด ค่าตรวจไฟและอุณหภูมิจากเครื่องจริงโดยผู้ตรวจที่เหมาะสมก่อนทดสอบ คนไม่เป็นโหลดแรก E-stop ต้องพิจารณา Motion, FFB และ Active brake แยกกัน ไม่ถือว่า GM5 หยุดอุปกรณ์ทั้งหมด</w:t>
       </w:r>
     </w:p>
@@ -2063,8 +2093,8 @@
         <w:t xml:space="preserve">ไม่ปล่อยโชว์หากยังมีปัญหาอันตรายหรือฟังก์ชันหลัก/ความเสถียรไม่ผ่าน ผู้ตรวจแต่ละด้านและผู้อนุมัติปล่อยเครื่องยังต้องแต่งตั้ง ทุก test เก็บรุ่น/firmware โปรไฟล์ โหลด วิธีวัด ผล ภาพ/log และรายการแก้ไข เกณฑ์นี้ไม่ใช่การรับรองผลิตภัณฑ์พร้อมขาย</w:t>
       </w:r>
     </w:p>
-    <w:bookmarkEnd w:id="38"/>
-    <w:bookmarkStart w:id="39" w:name="ความเสยงทตองเสนอพรอมแนวทางลด"/>
+    <w:bookmarkEnd w:id="39"/>
+    <w:bookmarkStart w:id="40" w:name="ความเสยงทตองเสนอพรอมแนวทางลด"/>
     <w:p>
       <w:pPr>
         <w:pStyle w:val="Heading2"/>
@@ -2432,8 +2462,8 @@
         </w:tc>
       </w:tr>
     </w:tbl>
-    <w:bookmarkEnd w:id="39"/>
-    <w:bookmarkStart w:id="40" w:name="แบงงานและสงสงมอบ"/>
+    <w:bookmarkEnd w:id="40"/>
+    <w:bookmarkStart w:id="41" w:name="แบงงานและสงสงมอบ"/>
     <w:p>
       <w:pPr>
         <w:pStyle w:val="Heading2"/>
@@ -2703,8 +2733,8 @@
         <w:t xml:space="preserve">ก่อนส่งต่อเครื่องต้นแบบต้องมีแบบ as-built, BOM พร้อมแหล่งซื้อ, รูปการเดินสาย, serial/version, โปรไฟล์สำรอง, วิธีเปิด–ปิด/หยุดฉุกเฉิน, ข้อจำกัดผู้ใช้, checklist ก่อนใช้, ตารางตรวจบำรุง และประวัติปัญหา</w:t>
       </w:r>
     </w:p>
-    <w:bookmarkEnd w:id="40"/>
-    <w:bookmarkStart w:id="41" w:name="คำถามใหผบรหารตดสนใจ"/>
+    <w:bookmarkEnd w:id="41"/>
+    <w:bookmarkStart w:id="42" w:name="คำถามใหผบรหารตดสนใจ"/>
     <w:p>
       <w:pPr>
         <w:pStyle w:val="Heading2"/>
@@ -2817,8 +2847,8 @@
         <w:t xml:space="preserve">ไม่ควรอนุมัติยอดซื้อทั้งหมดจากช่วงงบกว้างนี้ ให้กลับมาดูผลระยะ A, layout, BOM และราคาอีกครั้งที่จุดอนุมัติผลิต</w:t>
       </w:r>
     </w:p>
-    <w:bookmarkEnd w:id="41"/>
-    <w:bookmarkStart w:id="42" w:name="โครงพดนำเสนอ-5-นาท"/>
+    <w:bookmarkEnd w:id="42"/>
+    <w:bookmarkStart w:id="43" w:name="โครงพดนำเสนอ-5-นาท"/>
     <w:p>
       <w:pPr>
         <w:pStyle w:val="Heading2"/>
@@ -2859,8 +2889,8 @@
         <w:t xml:space="preserve">ขอบเขตพร้อมโชว์และบทบาท Mark/Chin ยืนยันแล้ว วันนี้ขอให้ตัดสินใจระดับอุปกรณ์ งบทดลอง วันโชว์ เวลาทีม และผู้ตรวจรับ เมื่อผ่านการทดลองจึงกลับมาอนุมัติแบบและงบผลิต พร้อมแผนตรวจรับที่วัดผลได้”</w:t>
       </w:r>
     </w:p>
-    <w:bookmarkEnd w:id="42"/>
-    <w:bookmarkStart w:id="43" w:name="ฐานขอมลและขอจำกด"/>
+    <w:bookmarkEnd w:id="43"/>
+    <w:bookmarkStart w:id="44" w:name="ฐานขอมลและขอจำกด"/>
     <w:p>
       <w:pPr>
         <w:pStyle w:val="Heading2"/>
@@ -2878,7 +2908,7 @@
         </w:numPr>
       </w:pPr>
       <w:r>
-        <w:t xml:space="preserve">PROJECT_CONTEXT.md v1.6 ใน repository และข้อสรุปผู้ใช้ 21 ต.ค.: ใช้เป็นฐานเป้าหมาย ข้อกำหนด ประมาณการน้ำหนัก และข้อมูลอ้างอิงเดิม ไม่ถือว่าอนุมัติการซื้อหรือผลิต</w:t>
+        <w:t xml:space="preserve">PROJECT_CONTEXT.md v1.7 ใน repository และข้อสรุปผู้ใช้ 21 ต.ค.: ใช้เป็นฐานเป้าหมาย ข้อกำหนด ประมาณการน้ำหนัก และข้อมูลอ้างอิงเดิม ไม่ถือว่าอนุมัติการซื้อหรือผลิต</w:t>
       </w:r>
     </w:p>
     <w:p>
@@ -2929,8 +2959,8 @@
         <w:t xml:space="preserve">งบ/เกณฑ์ล่าสุดอ้างอิง show-ready-plan-th.md วันที่ 21 ต.ค.; ช่วงงบ ระยะเวลา และเกณฑ์ทดสอบเป็นข้อเสนอเพื่อวางแผน ยังไม่มีการขอราคา ตรวจเครื่องจริง ทดสอบโหลด หรือรับรองความปลอดภัย</w:t>
       </w:r>
     </w:p>
-    <w:bookmarkEnd w:id="43"/>
     <w:bookmarkEnd w:id="44"/>
+    <w:bookmarkEnd w:id="45"/>
     <w:sectPr/>
   </w:body>
 </w:document>

</xml_diff>

<commit_message>
docs: prepare team briefing and coordinate-based dimension sheets
</commit_message>
<xml_diff>
--- a/docs/management-proposal-th.docx
+++ b/docs/management-proposal-th.docx
@@ -2,7 +2,7 @@
 <file path=word/document.xml><?xml version="1.0" encoding="utf-8"?>
 <w:document xmlns:w="http://schemas.openxmlformats.org/wordprocessingml/2006/main" xmlns:m="http://schemas.openxmlformats.org/officeDocument/2006/math" xmlns:r="http://schemas.openxmlformats.org/officeDocument/2006/relationships" xmlns:o="urn:schemas-microsoft-com:office:office" xmlns:v="urn:schemas-microsoft-com:vml" xmlns:w10="urn:schemas-microsoft-com:office:word" xmlns:a="http://schemas.openxmlformats.org/drawingml/2006/main" xmlns:pic="http://schemas.openxmlformats.org/drawingml/2006/picture" xmlns:wp="http://schemas.openxmlformats.org/drawingml/2006/wordprocessingDrawing">
   <w:body>
-    <w:bookmarkStart w:id="45" w:name="X49861809e5603b12f3141ea263738d784c873f5"/>
+    <w:bookmarkStart w:id="48" w:name="X49861809e5603b12f3141ea263738d784c873f5"/>
     <w:p>
       <w:pPr>
         <w:pStyle w:val="Heading1"/>
@@ -22,7 +22,7 @@
         <w:t xml:space="preserve"> </w:t>
       </w:r>
       <w:r>
-        <w:t xml:space="preserve">เป้าหมายประชุม: 29 ตุลาคม 2026 ตาม PROJECT_CONTEXT.md v1.7</w:t>
+        <w:t xml:space="preserve">เป้าหมายประชุม: 29 ตุลาคม 2026 ตาม PROJECT_CONTEXT.md v1.9</w:t>
       </w:r>
       <w:r>
         <w:t xml:space="preserve"> </w:t>
@@ -31,7 +31,7 @@
         <w:t xml:space="preserve">สถานะ: ข้อเสนอเพื่ออนุมัติศึกษารายละเอียดและพัฒนาต้นแบบ ไม่ใช่แบบผลิตหรือใบเสนอราคา</w:t>
       </w:r>
     </w:p>
-    <w:bookmarkStart w:id="20" w:name="สรปสำหรบผบรหาร"/>
+    <w:bookmarkStart w:id="23" w:name="สรปสำหรบผบรหาร"/>
     <w:p>
       <w:pPr>
         <w:pStyle w:val="Heading2"/>
@@ -44,6 +44,59 @@
       <w:pPr>
         <w:pStyle w:val="FirstParagraph"/>
       </w:pPr>
+      <w:hyperlink r:id="rId20">
+        <w:r>
+          <w:rPr>
+            <w:rStyle w:val="Hyperlink"/>
+          </w:rPr>
+          <w:t xml:space="preserve">ชุดสรุปคุยทีมล่าสุด</w:t>
+        </w:r>
+      </w:hyperlink>
+      <w:r>
+        <w:t xml:space="preserve"> </w:t>
+      </w:r>
+      <w:r>
+        <w:t xml:space="preserve">/</w:t>
+      </w:r>
+      <w:r>
+        <w:t xml:space="preserve"> </w:t>
+      </w:r>
+      <w:hyperlink r:id="rId21">
+        <w:r>
+          <w:rPr>
+            <w:rStyle w:val="Hyperlink"/>
+          </w:rPr>
+          <w:t xml:space="preserve">PDF</w:t>
+        </w:r>
+      </w:hyperlink>
+      <w:r>
+        <w:t xml:space="preserve"> </w:t>
+      </w:r>
+      <w:r>
+        <w:t xml:space="preserve">รวมสถานะทุกด้าน และ</w:t>
+      </w:r>
+      <w:r>
+        <w:t xml:space="preserve"> </w:t>
+      </w:r>
+      <w:hyperlink r:id="rId22">
+        <w:r>
+          <w:rPr>
+            <w:rStyle w:val="Hyperlink"/>
+          </w:rPr>
+          <w:t xml:space="preserve">แผ่นระยะ v04.1</w:t>
+        </w:r>
+      </w:hyperlink>
+      <w:r>
+        <w:t xml:space="preserve"> </w:t>
+      </w:r>
+      <w:r>
+        <w:t xml:space="preserve">แก้เส้นวัดจากภาพเรนเดอร์: S–W=400, S–แป้น=900, W–แป้น=500 มม. เป็นค่าตั้งต้น ไม่ใช่มิติผลิต</w:t>
+      </w:r>
+    </w:p>
+    <w:p>
+      <w:pPr>
+        <w:pStyle w:val="BodyText"/>
+      </w:pPr>
       <w:r>
         <w:t xml:space="preserve">พัฒนา Go-kart Simulator แบบ Modular โดยสร้างโครงท่อใหม่ให้มีรูปลักษณ์และท่านั่งใกล้โกคาร์ทจริง ใช้อุปกรณ์พวงมาลัย Force Feedback แป้นเบรก/คันเร่ง เกมสำเร็จรูป และระบบ Motion ที่มีซอฟต์แวร์รองรับ ผู้ใช้ยืนยันให้เครื่องแรกพร้อมนำไปโชว์ เสนอเริ่มหนึ่งเครื่องก่อนตัดสินใจเครื่องที่สองและการผลิตขาย โดยจำนวนเครื่องยังรออนุมัติ</w:t>
       </w:r>
@@ -129,11 +182,11 @@
         <w:pStyle w:val="FirstParagraph"/>
       </w:pPr>
       <w:r>
-        <w:t xml:space="preserve">สถานะ ณ 21 ต.ค.: Context v1.7 และภาพ/คลิปอ้างอิงอยู่ใน repository แล้ว เปิดและตรวจภาพคู่มือ GM5 ได้แล้ว แต่ไม่มีแบบติดตั้งโครงใหม่ที่ตรวจวิศวกรรมหรือผลทดสอบเครื่องจริง ตรวจหน้า Think of sim, GM5 และตัวอย่างจอซ้ำสำหรับแผนงบพร้อมโชว์แล้ว แต่ยังไม่มีใบเสนอราคาไทยครบชุด</w:t>
-      </w:r>
-    </w:p>
-    <w:bookmarkEnd w:id="20"/>
-    <w:bookmarkStart w:id="21" w:name="ขอบเขตเครองแรก"/>
+        <w:t xml:space="preserve">สถานะ ณ 21 ต.ค.: Context v1.9 และภาพ/คลิปอ้างอิงอยู่ใน repository แล้ว เปิดและตรวจภาพคู่มือ GM5 ได้แล้ว แต่ไม่มีแบบติดตั้งโครงใหม่ที่ตรวจวิศวกรรมหรือผลทดสอบเครื่องจริง ตรวจหน้า Think of sim, GM5 และตัวอย่างจอซ้ำสำหรับแผนงบพร้อมโชว์แล้ว แต่ยังไม่มีใบเสนอราคาไทยครบชุด</w:t>
+      </w:r>
+    </w:p>
+    <w:bookmarkEnd w:id="23"/>
+    <w:bookmarkStart w:id="24" w:name="ขอบเขตเครองแรก"/>
     <w:p>
       <w:pPr>
         <w:pStyle w:val="Heading2"/>
@@ -555,8 +608,8 @@
         <w:t xml:space="preserve">ให้พัฒนาการเชื่อมต่อและการตั้งค่าบนเกมสำเร็จรูปก่อน การเขียนเกมหรือ physics engine ใหม่ไม่รวมในงบและเวลาที่เสนอ หากต้องการเกมเฉพาะจะต้องประเมินเป็นโครงการเพิ่ม</w:t>
       </w:r>
     </w:p>
-    <w:bookmarkEnd w:id="21"/>
-    <w:bookmarkStart w:id="25" w:name="สถาปตยกรรมระบบและวธทำงาน"/>
+    <w:bookmarkEnd w:id="24"/>
+    <w:bookmarkStart w:id="28" w:name="สถาปตยกรรมระบบและวธทำงาน"/>
     <w:p>
       <w:pPr>
         <w:pStyle w:val="Heading2"/>
@@ -565,7 +618,7 @@
         <w:t xml:space="preserve">3. สถาปัตยกรรมระบบและวิธีทำงาน</w:t>
       </w:r>
     </w:p>
-    <w:bookmarkStart w:id="22" w:name="เสนทางขอมล"/>
+    <w:bookmarkStart w:id="25" w:name="เสนทางขอมล"/>
     <w:p>
       <w:pPr>
         <w:pStyle w:val="Heading3"/>
@@ -654,8 +707,8 @@
         <w:t xml:space="preserve">SimHub ไม่ได้ทำให้ทุกอุปกรณ์และทุกเกมรองรับทุก effect อัตโนมัติ ต้องตรวจแต่ละเส้นทาง โดยเฉพาะ Active brake และการหยุดเมื่อ telemetry หาย</w:t>
       </w:r>
     </w:p>
-    <w:bookmarkEnd w:id="22"/>
-    <w:bookmarkStart w:id="23" w:name="สงทจะพฒนาเอง"/>
+    <w:bookmarkEnd w:id="25"/>
+    <w:bookmarkStart w:id="26" w:name="สงทจะพฒนาเอง"/>
     <w:p>
       <w:pPr>
         <w:pStyle w:val="Heading3"/>
@@ -672,8 +725,8 @@
         <w:t xml:space="preserve">โครงท่อและจุดยึด เบาะ/รางและช่วงปรับ แท่นพวงมาลัยและแป้น ขาจอและชุดถอดประกอบ แฟริ่ง จุดจัดสาย โมดูลติดตั้ง ผังไฟ/USB วิธีประกอบ และโปรไฟล์ Motion ที่ทดสอบกับเครื่องจริง</w:t>
       </w:r>
     </w:p>
-    <w:bookmarkEnd w:id="23"/>
-    <w:bookmarkStart w:id="24" w:name="สงทจะซอหรอใชงานรวม"/>
+    <w:bookmarkEnd w:id="26"/>
+    <w:bookmarkStart w:id="27" w:name="สงทจะซอหรอใชงานรวม"/>
     <w:p>
       <w:pPr>
         <w:pStyle w:val="Heading3"/>
@@ -690,9 +743,9 @@
         <w:t xml:space="preserve">Motion/controller, ฐานพวงมาลัย/วงพวงมาลัย/แป้น, จอ, PC, เบาะ/รางตามความเหมาะสม, อุปกรณ์ไฟ และไลเซนส์ซอฟต์แวร์ ไม่แนะนำเริ่มจากออกแบบ actuator และ drive กำลังสูงเองพร้อมกับพัฒนาโครงใหม่ เพราะเพิ่มขอบเขตงานของทีมสองคนมาก</w:t>
       </w:r>
     </w:p>
-    <w:bookmarkEnd w:id="24"/>
-    <w:bookmarkEnd w:id="25"/>
-    <w:bookmarkStart w:id="31" w:name="งานเครองกล-จาก-reference-ไปเปนแบบทผลตได"/>
+    <w:bookmarkEnd w:id="27"/>
+    <w:bookmarkEnd w:id="28"/>
+    <w:bookmarkStart w:id="34" w:name="งานเครองกล-จาก-reference-ไปเปนแบบทผลตได"/>
     <w:p>
       <w:pPr>
         <w:pStyle w:val="Heading2"/>
@@ -701,7 +754,7 @@
         <w:t xml:space="preserve">4. งานเครื่องกล: จาก reference ไปเป็นแบบที่ผลิตได้</w:t>
       </w:r>
     </w:p>
-    <w:bookmarkStart w:id="27" w:name="วดระยะและทำ-mock-up-กอน-cad-รายละเอยด"/>
+    <w:bookmarkStart w:id="30" w:name="วดระยะและทำ-mock-up-กอน-cad-รายละเอยด"/>
     <w:p>
       <w:pPr>
         <w:pStyle w:val="Heading3"/>
@@ -720,7 +773,7 @@
       <w:r>
         <w:t xml:space="preserve"> </w:t>
       </w:r>
-      <w:hyperlink r:id="rId26">
+      <w:hyperlink r:id="rId29">
         <w:r>
           <w:rPr>
             <w:rStyle w:val="Hyperlink"/>
@@ -756,8 +809,8 @@
         <w:t xml:space="preserve">ผลส่งมอบ: ตารางระยะตั้งต้นและช่วงปรับ พร้อมภาพทดลองท่านั่ง และรายการจุดที่ต้องปรับได้</w:t>
       </w:r>
     </w:p>
-    <w:bookmarkEnd w:id="27"/>
-    <w:bookmarkStart w:id="28" w:name="ออกแบบโครงและโมดล"/>
+    <w:bookmarkEnd w:id="30"/>
+    <w:bookmarkStart w:id="31" w:name="ออกแบบโครงและโมดล"/>
     <w:p>
       <w:pPr>
         <w:pStyle w:val="Heading3"/>
@@ -850,8 +903,8 @@
         <w:t xml:space="preserve">ให้ผู้มีความสามารถตรวจโหลด โครงสร้าง รอยเชื่อม และข้อต่อก่อนใช้กับคน การวิเคราะห์ใน CAD เป็นส่วนหนึ่งของหลักฐาน ไม่แทนการตรวจงานจริง</w:t>
       </w:r>
     </w:p>
-    <w:bookmarkEnd w:id="28"/>
-    <w:bookmarkStart w:id="29" w:name="motion-และนำหนก"/>
+    <w:bookmarkEnd w:id="31"/>
+    <w:bookmarkStart w:id="32" w:name="motion-และนำหนก"/>
     <w:p>
       <w:pPr>
         <w:pStyle w:val="Heading3"/>
@@ -944,8 +997,8 @@
         <w:t xml:space="preserve">ขอข้อจำกัดจากผู้ผลิตก่อนเปลี่ยนตำแหน่ง actuator หรือขายึดจากรูปแบบที่ผู้ผลิตรองรับ</w:t>
       </w:r>
     </w:p>
-    <w:bookmarkEnd w:id="29"/>
-    <w:bookmarkStart w:id="30" w:name="ขาจอสามจอ"/>
+    <w:bookmarkEnd w:id="32"/>
+    <w:bookmarkStart w:id="33" w:name="ขาจอสามจอ"/>
     <w:p>
       <w:pPr>
         <w:pStyle w:val="Heading3"/>
@@ -970,9 +1023,9 @@
         <w:t xml:space="preserve">เริ่มทดสอบด้วยน้ำหนักจำลองที่ยึดอย่างเหมาะสมก่อนติดจอจริง ไม่สรุปว่าจอทั่วไปทน Motion ได้โดยไม่มีข้อมูลหรือทดสอบ</w:t>
       </w:r>
     </w:p>
-    <w:bookmarkEnd w:id="30"/>
-    <w:bookmarkEnd w:id="31"/>
-    <w:bookmarkStart w:id="32" w:name="ระบบไฟฟาและการหยดฉกเฉน"/>
+    <w:bookmarkEnd w:id="33"/>
+    <w:bookmarkEnd w:id="34"/>
+    <w:bookmarkStart w:id="35" w:name="ระบบไฟฟาและการหยดฉกเฉน"/>
     <w:p>
       <w:pPr>
         <w:pStyle w:val="Heading2"/>
@@ -1081,8 +1134,8 @@
         <w:t xml:space="preserve">การเลือกมาตรฐานและการประเมินข้อกำหนดผลิตภัณฑ์ในไทยต้องอิงการจัดประเภทสินค้าจริง ให้ผู้เชี่ยวชาญตรวจด้านเครื่องจักร ไฟฟ้า EMC และเอกสารที่ต้องมี ก่อนวางขาย ไม่ถือว่าการใช้อุปกรณ์สำเร็จรูปทำให้ทั้งเครื่องได้รับการรับรองแล้ว</w:t>
       </w:r>
     </w:p>
-    <w:bookmarkEnd w:id="32"/>
-    <w:bookmarkStart w:id="33" w:name="ซอฟตแวร-เกม-และการสราง-feeling"/>
+    <w:bookmarkEnd w:id="35"/>
+    <w:bookmarkStart w:id="36" w:name="ซอฟตแวร-เกม-และการสราง-feeling"/>
     <w:p>
       <w:pPr>
         <w:pStyle w:val="Heading2"/>
@@ -1195,8 +1248,8 @@
         <w:t xml:space="preserve">ประเด็นสิทธิ์ใช้งาน: ตรวจแยกสิทธิ์เกม SimHub Motion และซอฟต์แวร์อุปกรณ์ สำหรับขายเครื่องพร้อมซอฟต์แวร์ ให้บริการเล่น จัดงาน และหลายเครื่อง ขอหลักฐานเงื่อนไขที่ใช้กับรูปแบบธุรกิจ ไม่ถือว่าไลเซนส์ส่วนบุคคลใช้เชิงพาณิชย์ได้อัตโนมัติ</w:t>
       </w:r>
     </w:p>
-    <w:bookmarkEnd w:id="33"/>
-    <w:bookmarkStart w:id="36" w:name="งบประมาณเครองพรอมโชว-กรอบเสนอ"/>
+    <w:bookmarkEnd w:id="36"/>
+    <w:bookmarkStart w:id="39" w:name="งบประมาณเครองพรอมโชว-กรอบเสนอ"/>
     <w:p>
       <w:pPr>
         <w:pStyle w:val="Heading2"/>
@@ -1215,7 +1268,7 @@
       <w:r>
         <w:t xml:space="preserve"> </w:t>
       </w:r>
-      <w:hyperlink r:id="rId34">
+      <w:hyperlink r:id="rId37">
         <w:r>
           <w:rPr>
             <w:rStyle w:val="Hyperlink"/>
@@ -1598,7 +1651,7 @@
         <w:t xml:space="preserve">รายละเอียดทุกหมวด ชั่วโมงพัฒนา สมมติฐาน และแหล่งราคาอยู่ในแผนพร้อมโชว์: ตรวจ Think of sim ซ้ำพบ EVO 12Nm 19,770 และ P-Active เดี่ยว 38,050 บาท รวมเฉพาะสองชิ้น 57,820 บาท ทั้งสองแสดง Sold out; ยังไม่เลือกแบรนด์หรือยืนยันสต็อก ตัวอย่างจอ JIB 6,900 บาทเป็นราคาที่หน้าระบุอัปเดต 21 เม.ย. 2025 และสินค้าหมด จึงไม่ใช่ราคาซื้อปัจจุบัน ราคา GM5 ไทยยังไม่ยืนยัน</w:t>
       </w:r>
     </w:p>
-    <w:bookmarkStart w:id="35" w:name="เปลยนชวงงบใหเปน-bom-ทอนมตได"/>
+    <w:bookmarkStart w:id="38" w:name="เปลยนชวงงบใหเปน-bom-ทอนมตได"/>
     <w:p>
       <w:pPr>
         <w:pStyle w:val="Heading3"/>
@@ -1615,9 +1668,9 @@
         <w:t xml:space="preserve">แต่ละรายการต้องมีรหัส จำนวน รุ่น/แบบ ผู้ขาย ราคา วันที่/อายุราคา VAT/ขนส่ง lead time ประกัน รวม/ไม่รวม และสถานะมีของ/ยืม/รอราคา/รอเลือก ตรวจ bundle และของในชุด GM5 เพื่อไม่คิดซ้ำ ต้นทุนขายภายหลังต้องรวมบริการ อะไหล่ ประกัน ค่าใช้จ่ายองค์กร และต้นทุนธุรกิจเพิ่มเติมก่อนตั้งราคาขาย รอบนี้ยังพักศึกษาตลาด/คู่แข่ง</w:t>
       </w:r>
     </w:p>
-    <w:bookmarkEnd w:id="35"/>
-    <w:bookmarkEnd w:id="36"/>
-    <w:bookmarkStart w:id="38" w:name="แผนดำเนนงานและจดตดสนใจ"/>
+    <w:bookmarkEnd w:id="38"/>
+    <w:bookmarkEnd w:id="39"/>
+    <w:bookmarkStart w:id="41" w:name="แผนดำเนนงานและจดตดสนใจ"/>
     <w:p>
       <w:pPr>
         <w:pStyle w:val="Heading2"/>
@@ -1960,7 +2013,7 @@
         <w:t xml:space="preserve">การอนุมัติต้นแบบไม่ได้แปลว่าพร้อมขายทันที ต้องประเมินความทนทาน การผลิตซ้ำ เอกสารผลิตภัณฑ์ และบริการเพิ่มก่อนเปิดขาย</w:t>
       </w:r>
     </w:p>
-    <w:bookmarkStart w:id="37" w:name="งานทตองมสำหรบประชม-29-ตลาคม"/>
+    <w:bookmarkStart w:id="40" w:name="งานทตองมสำหรบประชม-29-ตลาคม"/>
     <w:p>
       <w:pPr>
         <w:pStyle w:val="Heading3"/>
@@ -2025,9 +2078,9 @@
         <w:t xml:space="preserve">นี่เป็นแผนเสนอ ไม่ได้ยืนยันว่างานหรือการนัดหมายเกิดขึ้นแล้ว การติดต่อผู้ขายต้องมีผู้รับผิดชอบและการมอบหมายจริง</w:t>
       </w:r>
     </w:p>
-    <w:bookmarkEnd w:id="37"/>
-    <w:bookmarkEnd w:id="38"/>
-    <w:bookmarkStart w:id="39" w:name="เกณฑตรวจรบเครองพรอมโชว-รางเสนอ-v0.1"/>
+    <w:bookmarkEnd w:id="40"/>
+    <w:bookmarkEnd w:id="41"/>
+    <w:bookmarkStart w:id="42" w:name="เกณฑตรวจรบเครองพรอมโชว-รางเสนอ-v0.1"/>
     <w:p>
       <w:pPr>
         <w:pStyle w:val="Heading2"/>
@@ -2046,7 +2099,7 @@
       <w:r>
         <w:t xml:space="preserve"> </w:t>
       </w:r>
-      <w:hyperlink r:id="rId34">
+      <w:hyperlink r:id="rId37">
         <w:r>
           <w:rPr>
             <w:rStyle w:val="Hyperlink"/>
@@ -2093,8 +2146,8 @@
         <w:t xml:space="preserve">ไม่ปล่อยโชว์หากยังมีปัญหาอันตรายหรือฟังก์ชันหลัก/ความเสถียรไม่ผ่าน ผู้ตรวจแต่ละด้านและผู้อนุมัติปล่อยเครื่องยังต้องแต่งตั้ง ทุก test เก็บรุ่น/firmware โปรไฟล์ โหลด วิธีวัด ผล ภาพ/log และรายการแก้ไข เกณฑ์นี้ไม่ใช่การรับรองผลิตภัณฑ์พร้อมขาย</w:t>
       </w:r>
     </w:p>
-    <w:bookmarkEnd w:id="39"/>
-    <w:bookmarkStart w:id="40" w:name="ความเสยงทตองเสนอพรอมแนวทางลด"/>
+    <w:bookmarkEnd w:id="42"/>
+    <w:bookmarkStart w:id="43" w:name="ความเสยงทตองเสนอพรอมแนวทางลด"/>
     <w:p>
       <w:pPr>
         <w:pStyle w:val="Heading2"/>
@@ -2462,8 +2515,8 @@
         </w:tc>
       </w:tr>
     </w:tbl>
-    <w:bookmarkEnd w:id="40"/>
-    <w:bookmarkStart w:id="41" w:name="แบงงานและสงสงมอบ"/>
+    <w:bookmarkEnd w:id="43"/>
+    <w:bookmarkStart w:id="44" w:name="แบงงานและสงสงมอบ"/>
     <w:p>
       <w:pPr>
         <w:pStyle w:val="Heading2"/>
@@ -2733,8 +2786,8 @@
         <w:t xml:space="preserve">ก่อนส่งต่อเครื่องต้นแบบต้องมีแบบ as-built, BOM พร้อมแหล่งซื้อ, รูปการเดินสาย, serial/version, โปรไฟล์สำรอง, วิธีเปิด–ปิด/หยุดฉุกเฉิน, ข้อจำกัดผู้ใช้, checklist ก่อนใช้, ตารางตรวจบำรุง และประวัติปัญหา</w:t>
       </w:r>
     </w:p>
-    <w:bookmarkEnd w:id="41"/>
-    <w:bookmarkStart w:id="42" w:name="คำถามใหผบรหารตดสนใจ"/>
+    <w:bookmarkEnd w:id="44"/>
+    <w:bookmarkStart w:id="45" w:name="คำถามใหผบรหารตดสนใจ"/>
     <w:p>
       <w:pPr>
         <w:pStyle w:val="Heading2"/>
@@ -2847,8 +2900,8 @@
         <w:t xml:space="preserve">ไม่ควรอนุมัติยอดซื้อทั้งหมดจากช่วงงบกว้างนี้ ให้กลับมาดูผลระยะ A, layout, BOM และราคาอีกครั้งที่จุดอนุมัติผลิต</w:t>
       </w:r>
     </w:p>
-    <w:bookmarkEnd w:id="42"/>
-    <w:bookmarkStart w:id="43" w:name="โครงพดนำเสนอ-5-นาท"/>
+    <w:bookmarkEnd w:id="45"/>
+    <w:bookmarkStart w:id="46" w:name="โครงพดนำเสนอ-5-นาท"/>
     <w:p>
       <w:pPr>
         <w:pStyle w:val="Heading2"/>
@@ -2889,8 +2942,8 @@
         <w:t xml:space="preserve">ขอบเขตพร้อมโชว์และบทบาท Mark/Chin ยืนยันแล้ว วันนี้ขอให้ตัดสินใจระดับอุปกรณ์ งบทดลอง วันโชว์ เวลาทีม และผู้ตรวจรับ เมื่อผ่านการทดลองจึงกลับมาอนุมัติแบบและงบผลิต พร้อมแผนตรวจรับที่วัดผลได้”</w:t>
       </w:r>
     </w:p>
-    <w:bookmarkEnd w:id="43"/>
-    <w:bookmarkStart w:id="44" w:name="ฐานขอมลและขอจำกด"/>
+    <w:bookmarkEnd w:id="46"/>
+    <w:bookmarkStart w:id="47" w:name="ฐานขอมลและขอจำกด"/>
     <w:p>
       <w:pPr>
         <w:pStyle w:val="Heading2"/>
@@ -2908,7 +2961,7 @@
         </w:numPr>
       </w:pPr>
       <w:r>
-        <w:t xml:space="preserve">PROJECT_CONTEXT.md v1.7 ใน repository และข้อสรุปผู้ใช้ 21 ต.ค.: ใช้เป็นฐานเป้าหมาย ข้อกำหนด ประมาณการน้ำหนัก และข้อมูลอ้างอิงเดิม ไม่ถือว่าอนุมัติการซื้อหรือผลิต</w:t>
+        <w:t xml:space="preserve">PROJECT_CONTEXT.md v1.9 ใน repository และข้อสรุปผู้ใช้ 21 ต.ค.: ใช้เป็นฐานเป้าหมาย ข้อกำหนด ประมาณการน้ำหนัก และข้อมูลอ้างอิงเดิม ไม่ถือว่าอนุมัติการซื้อหรือผลิต</w:t>
       </w:r>
     </w:p>
     <w:p>
@@ -2959,8 +3012,8 @@
         <w:t xml:space="preserve">งบ/เกณฑ์ล่าสุดอ้างอิง show-ready-plan-th.md วันที่ 21 ต.ค.; ช่วงงบ ระยะเวลา และเกณฑ์ทดสอบเป็นข้อเสนอเพื่อวางแผน ยังไม่มีการขอราคา ตรวจเครื่องจริง ทดสอบโหลด หรือรับรองความปลอดภัย</w:t>
       </w:r>
     </w:p>
-    <w:bookmarkEnd w:id="44"/>
-    <w:bookmarkEnd w:id="45"/>
+    <w:bookmarkEnd w:id="47"/>
+    <w:bookmarkEnd w:id="48"/>
     <w:sectPr/>
   </w:body>
 </w:document>

</xml_diff>